<commit_message>
Add trio-dnm demo command, styled protocol docx and PDF
- trio-dnm demo runs every stage on a simulated trio (tested)
- protocol docx uses named Code Block / Note / Inline Code styles; PDF rendition added

Co-Authored-By: Claude Opus 5.5 <noreply@anthropic.com>
Claude-Session: https://claude.ai/code/session_01VEVoh7uYcmCbtW2HcZednP
</commit_message>
<xml_diff>
--- a/trio_dnm_pipeline/docs/Trio_DNM_Pipeline_Protocol_v2.0.docx
+++ b/trio_dnm_pipeline/docs/Trio_DNM_Pipeline_Protocol_v2.0.docx
@@ -385,7 +385,7 @@
           <w:p>
             <w:r>
               <w:rPr>
-                <w:rFonts w:ascii="Consolas" w:cs="Consolas" w:eastAsia="Consolas" w:hAnsi="Consolas"/>
+                <w:rStyle w:val="InlineCode"/>
                 <w:sz w:val="18"/>
                 <w:szCs w:val="18"/>
               </w:rPr>
@@ -400,7 +400,7 @@
             </w:r>
             <w:r>
               <w:rPr>
-                <w:rFonts w:ascii="Consolas" w:cs="Consolas" w:eastAsia="Consolas" w:hAnsi="Consolas"/>
+                <w:rStyle w:val="InlineCode"/>
                 <w:sz w:val="18"/>
                 <w:szCs w:val="18"/>
               </w:rPr>
@@ -797,7 +797,7 @@
           <w:p>
             <w:r>
               <w:rPr>
-                <w:rFonts w:ascii="Consolas" w:cs="Consolas" w:eastAsia="Consolas" w:hAnsi="Consolas"/>
+                <w:rStyle w:val="InlineCode"/>
                 <w:sz w:val="18"/>
                 <w:szCs w:val="18"/>
               </w:rPr>
@@ -812,7 +812,7 @@
             </w:r>
             <w:r>
               <w:rPr>
-                <w:rFonts w:ascii="Consolas" w:cs="Consolas" w:eastAsia="Consolas" w:hAnsi="Consolas"/>
+                <w:rStyle w:val="InlineCode"/>
                 <w:sz w:val="18"/>
                 <w:szCs w:val="18"/>
               </w:rPr>
@@ -879,7 +879,7 @@
             </w:r>
             <w:r>
               <w:rPr>
-                <w:rFonts w:ascii="Consolas" w:cs="Consolas" w:eastAsia="Consolas" w:hAnsi="Consolas"/>
+                <w:rStyle w:val="InlineCode"/>
                 <w:sz w:val="18"/>
                 <w:szCs w:val="18"/>
               </w:rPr>
@@ -974,7 +974,7 @@
             </w:r>
             <w:r>
               <w:rPr>
-                <w:rFonts w:ascii="Consolas" w:cs="Consolas" w:eastAsia="Consolas" w:hAnsi="Consolas"/>
+                <w:rStyle w:val="InlineCode"/>
                 <w:sz w:val="18"/>
                 <w:szCs w:val="18"/>
               </w:rPr>
@@ -989,7 +989,7 @@
             </w:r>
             <w:r>
               <w:rPr>
-                <w:rFonts w:ascii="Consolas" w:cs="Consolas" w:eastAsia="Consolas" w:hAnsi="Consolas"/>
+                <w:rStyle w:val="InlineCode"/>
                 <w:sz w:val="18"/>
                 <w:szCs w:val="18"/>
               </w:rPr>
@@ -1129,7 +1129,7 @@
           <w:p>
             <w:r>
               <w:rPr>
-                <w:rFonts w:ascii="Consolas" w:cs="Consolas" w:eastAsia="Consolas" w:hAnsi="Consolas"/>
+                <w:rStyle w:val="InlineCode"/>
                 <w:sz w:val="18"/>
                 <w:szCs w:val="18"/>
               </w:rPr>
@@ -1533,7 +1533,7 @@
           <w:p>
             <w:r>
               <w:rPr>
-                <w:rFonts w:ascii="Consolas" w:cs="Consolas" w:eastAsia="Consolas" w:hAnsi="Consolas"/>
+                <w:rStyle w:val="InlineCode"/>
                 <w:sz w:val="18"/>
                 <w:szCs w:val="18"/>
               </w:rPr>
@@ -1548,7 +1548,7 @@
             </w:r>
             <w:r>
               <w:rPr>
-                <w:rFonts w:ascii="Consolas" w:cs="Consolas" w:eastAsia="Consolas" w:hAnsi="Consolas"/>
+                <w:rStyle w:val="InlineCode"/>
                 <w:sz w:val="18"/>
                 <w:szCs w:val="18"/>
               </w:rPr>
@@ -1563,7 +1563,7 @@
             </w:r>
             <w:r>
               <w:rPr>
-                <w:rFonts w:ascii="Consolas" w:cs="Consolas" w:eastAsia="Consolas" w:hAnsi="Consolas"/>
+                <w:rStyle w:val="InlineCode"/>
                 <w:sz w:val="18"/>
                 <w:szCs w:val="18"/>
               </w:rPr>
@@ -1578,7 +1578,7 @@
             </w:r>
             <w:r>
               <w:rPr>
-                <w:rFonts w:ascii="Consolas" w:cs="Consolas" w:eastAsia="Consolas" w:hAnsi="Consolas"/>
+                <w:rStyle w:val="InlineCode"/>
                 <w:sz w:val="18"/>
                 <w:szCs w:val="18"/>
               </w:rPr>
@@ -1645,7 +1645,7 @@
             </w:r>
             <w:r>
               <w:rPr>
-                <w:rFonts w:ascii="Consolas" w:cs="Consolas" w:eastAsia="Consolas" w:hAnsi="Consolas"/>
+                <w:rStyle w:val="InlineCode"/>
                 <w:sz w:val="18"/>
                 <w:szCs w:val="18"/>
               </w:rPr>
@@ -2277,7 +2277,7 @@
           <w:p>
             <w:r>
               <w:rPr>
-                <w:rFonts w:ascii="Consolas" w:cs="Consolas" w:eastAsia="Consolas" w:hAnsi="Consolas"/>
+                <w:rStyle w:val="InlineCode"/>
                 <w:sz w:val="18"/>
                 <w:szCs w:val="18"/>
               </w:rPr>
@@ -2688,7 +2688,7 @@
             </w:r>
             <w:r>
               <w:rPr>
-                <w:rFonts w:ascii="Consolas" w:cs="Consolas" w:eastAsia="Consolas" w:hAnsi="Consolas"/>
+                <w:rStyle w:val="InlineCode"/>
                 <w:sz w:val="18"/>
                 <w:szCs w:val="18"/>
               </w:rPr>
@@ -3231,7 +3231,7 @@
             </w:r>
             <w:r>
               <w:rPr>
-                <w:rFonts w:ascii="Consolas" w:cs="Consolas" w:eastAsia="Consolas" w:hAnsi="Consolas"/>
+                <w:rStyle w:val="InlineCode"/>
                 <w:sz w:val="18"/>
                 <w:szCs w:val="18"/>
               </w:rPr>
@@ -3246,7 +3246,7 @@
             </w:r>
             <w:r>
               <w:rPr>
-                <w:rFonts w:ascii="Consolas" w:cs="Consolas" w:eastAsia="Consolas" w:hAnsi="Consolas"/>
+                <w:rStyle w:val="InlineCode"/>
                 <w:sz w:val="18"/>
                 <w:szCs w:val="18"/>
               </w:rPr>
@@ -3470,9 +3470,7 @@
       </w:r>
       <w:r>
         <w:rPr>
-          <w:rFonts w:ascii="Consolas" w:cs="Consolas" w:eastAsia="Consolas" w:hAnsi="Consolas"/>
-          <w:sz w:val="18"/>
-          <w:szCs w:val="18"/>
+          <w:rStyle w:val="InlineCode"/>
         </w:rPr>
         <w:t xml:space="preserve">trio-dnm</w:t>
       </w:r>
@@ -3565,9 +3563,7 @@
       </w:r>
       <w:r>
         <w:rPr>
-          <w:rFonts w:ascii="Consolas" w:cs="Consolas" w:eastAsia="Consolas" w:hAnsi="Consolas"/>
-          <w:sz w:val="18"/>
-          <w:szCs w:val="18"/>
+          <w:rStyle w:val="InlineCode"/>
         </w:rPr>
         <w:t xml:space="preserve">family_id, sample_id, role (proband | father | mother | tumor | tissue), sex, bam</w:t>
       </w:r>
@@ -3589,9 +3585,7 @@
       </w:r>
       <w:r>
         <w:rPr>
-          <w:rFonts w:ascii="Consolas" w:cs="Consolas" w:eastAsia="Consolas" w:hAnsi="Consolas"/>
-          <w:sz w:val="18"/>
-          <w:szCs w:val="18"/>
+          <w:rStyle w:val="InlineCode"/>
         </w:rPr>
         <w:t xml:space="preserve">@RG SM</w:t>
       </w:r>
@@ -3969,7 +3963,7 @@
             </w:r>
             <w:r>
               <w:rPr>
-                <w:rFonts w:ascii="Consolas" w:cs="Consolas" w:eastAsia="Consolas" w:hAnsi="Consolas"/>
+                <w:rStyle w:val="InlineCode"/>
                 <w:sz w:val="18"/>
                 <w:szCs w:val="18"/>
               </w:rPr>
@@ -3984,7 +3978,7 @@
             </w:r>
             <w:r>
               <w:rPr>
-                <w:rFonts w:ascii="Consolas" w:cs="Consolas" w:eastAsia="Consolas" w:hAnsi="Consolas"/>
+                <w:rStyle w:val="InlineCode"/>
                 <w:sz w:val="18"/>
                 <w:szCs w:val="18"/>
               </w:rPr>
@@ -4763,9 +4757,7 @@
       </w:r>
       <w:r>
         <w:rPr>
-          <w:rFonts w:ascii="Consolas" w:cs="Consolas" w:eastAsia="Consolas" w:hAnsi="Consolas"/>
-          <w:sz w:val="18"/>
-          <w:szCs w:val="18"/>
+          <w:rStyle w:val="InlineCode"/>
         </w:rPr>
         <w:t xml:space="preserve">nextflow.config</w:t>
       </w:r>
@@ -5861,9 +5853,7 @@
       </w:r>
       <w:r>
         <w:rPr>
-          <w:rFonts w:ascii="Consolas" w:cs="Consolas" w:eastAsia="Consolas" w:hAnsi="Consolas"/>
-          <w:sz w:val="18"/>
-          <w:szCs w:val="18"/>
+          <w:rStyle w:val="InlineCode"/>
         </w:rPr>
         <w:t xml:space="preserve">trio-dnm qc-gate</w:t>
       </w:r>
@@ -5955,9 +5945,7 @@
       </w:r>
       <w:r>
         <w:rPr>
-          <w:rFonts w:ascii="Consolas" w:cs="Consolas" w:eastAsia="Consolas" w:hAnsi="Consolas"/>
-          <w:sz w:val="18"/>
-          <w:szCs w:val="18"/>
+          <w:rStyle w:val="InlineCode"/>
         </w:rPr>
         <w:t xml:space="preserve">relate</w:t>
       </w:r>
@@ -6025,9 +6013,7 @@
       </w:r>
       <w:r>
         <w:rPr>
-          <w:rFonts w:ascii="Consolas" w:cs="Consolas" w:eastAsia="Consolas" w:hAnsi="Consolas"/>
-          <w:sz w:val="18"/>
-          <w:szCs w:val="18"/>
+          <w:rStyle w:val="InlineCode"/>
         </w:rPr>
         <w:t xml:space="preserve">trio-dnm call</w:t>
       </w:r>
@@ -6574,58 +6560,38 @@
     </w:p>
     <w:p>
       <w:pPr>
-        <w:shd w:fill="F2F2F2" w:color="auto" w:val="clear"/>
+        <w:pStyle w:val="CodeBlock"/>
         <w:spacing w:after="0" w:before="80"/>
-        <w:ind w:left="144" w:right="144"/>
+      </w:pPr>
+      <w:r>
+        <w:t xml:space="preserve">bwa-mem2 mem -t 16 -K 100000000 -Y \</w:t>
+      </w:r>
+    </w:p>
+    <w:p>
+      <w:pPr>
+        <w:pStyle w:val="CodeBlock"/>
+        <w:spacing w:after="0" w:before="0"/>
+      </w:pPr>
+      <w:r>
+        <w:t xml:space="preserve">    -R "@RG\tID:${fc}.${lane}\tSM:${sm}\tLB:${lb}\tPL:ILLUMINA\tPU:${fc}.${lane}.${barcode}" \</w:t>
+      </w:r>
+    </w:p>
+    <w:p>
+      <w:pPr>
+        <w:pStyle w:val="CodeBlock"/>
+        <w:spacing w:after="140" w:before="0"/>
+      </w:pPr>
+      <w:r>
+        <w:t xml:space="preserve">    ${REF} ${R1} ${R2} | samtools sort -@ 8 -m 2G -o ${id}.sorted.bam -</w:t>
+      </w:r>
+    </w:p>
+    <w:p>
+      <w:pPr>
+        <w:spacing w:after="120"/>
       </w:pPr>
       <w:r>
         <w:rPr>
-          <w:rFonts w:ascii="Consolas" w:cs="Consolas" w:eastAsia="Consolas" w:hAnsi="Consolas"/>
-          <w:sz w:val="16"/>
-          <w:szCs w:val="16"/>
-        </w:rPr>
-        <w:t xml:space="preserve">bwa-mem2 mem -t 16 -K 100000000 -Y \</w:t>
-      </w:r>
-    </w:p>
-    <w:p>
-      <w:pPr>
-        <w:shd w:fill="F2F2F2" w:color="auto" w:val="clear"/>
-        <w:spacing w:after="0" w:before="0"/>
-        <w:ind w:left="144" w:right="144"/>
-      </w:pPr>
-      <w:r>
-        <w:rPr>
-          <w:rFonts w:ascii="Consolas" w:cs="Consolas" w:eastAsia="Consolas" w:hAnsi="Consolas"/>
-          <w:sz w:val="16"/>
-          <w:szCs w:val="16"/>
-        </w:rPr>
-        <w:t xml:space="preserve">    -R "@RG\tID:${fc}.${lane}\tSM:${sm}\tLB:${lb}\tPL:ILLUMINA\tPU:${fc}.${lane}.${barcode}" \</w:t>
-      </w:r>
-    </w:p>
-    <w:p>
-      <w:pPr>
-        <w:shd w:fill="F2F2F2" w:color="auto" w:val="clear"/>
-        <w:spacing w:after="140" w:before="0"/>
-        <w:ind w:left="144" w:right="144"/>
-      </w:pPr>
-      <w:r>
-        <w:rPr>
-          <w:rFonts w:ascii="Consolas" w:cs="Consolas" w:eastAsia="Consolas" w:hAnsi="Consolas"/>
-          <w:sz w:val="16"/>
-          <w:szCs w:val="16"/>
-        </w:rPr>
-        <w:t xml:space="preserve">    ${REF} ${R1} ${R2} | samtools sort -@ 8 -m 2G -o ${id}.sorted.bam -</w:t>
-      </w:r>
-    </w:p>
-    <w:p>
-      <w:pPr>
-        <w:spacing w:after="120"/>
-      </w:pPr>
-      <w:r>
-        <w:rPr>
-          <w:rFonts w:ascii="Consolas" w:cs="Consolas" w:eastAsia="Consolas" w:hAnsi="Consolas"/>
-          <w:sz w:val="18"/>
-          <w:szCs w:val="18"/>
+          <w:rStyle w:val="InlineCode"/>
         </w:rPr>
         <w:t xml:space="preserve">-Y</w:t>
       </w:r>
@@ -6634,9 +6600,7 @@
       </w:r>
       <w:r>
         <w:rPr>
-          <w:rFonts w:ascii="Consolas" w:cs="Consolas" w:eastAsia="Consolas" w:hAnsi="Consolas"/>
-          <w:sz w:val="18"/>
-          <w:szCs w:val="18"/>
+          <w:rStyle w:val="InlineCode"/>
         </w:rPr>
         <w:t xml:space="preserve">-K</w:t>
       </w:r>
@@ -6698,141 +6662,88 @@
     </w:p>
     <w:p>
       <w:pPr>
-        <w:shd w:fill="F2F2F2" w:color="auto" w:val="clear"/>
+        <w:pStyle w:val="CodeBlock"/>
         <w:spacing w:after="0" w:before="80"/>
-        <w:ind w:left="144" w:right="144"/>
-      </w:pPr>
-      <w:r>
-        <w:rPr>
-          <w:rFonts w:ascii="Consolas" w:cs="Consolas" w:eastAsia="Consolas" w:hAnsi="Consolas"/>
-          <w:sz w:val="16"/>
-          <w:szCs w:val="16"/>
-        </w:rPr>
+      </w:pPr>
+      <w:r>
         <w:t xml:space="preserve"># PCR-free library: disable the PCR indel model. Keep comments OFF continued lines.</w:t>
       </w:r>
     </w:p>
     <w:p>
       <w:pPr>
-        <w:shd w:fill="F2F2F2" w:color="auto" w:val="clear"/>
+        <w:pStyle w:val="CodeBlock"/>
         <w:spacing w:after="0" w:before="0"/>
-        <w:ind w:left="144" w:right="144"/>
-      </w:pPr>
-      <w:r>
-        <w:rPr>
-          <w:rFonts w:ascii="Consolas" w:cs="Consolas" w:eastAsia="Consolas" w:hAnsi="Consolas"/>
-          <w:sz w:val="16"/>
-          <w:szCs w:val="16"/>
-        </w:rPr>
+      </w:pPr>
+      <w:r>
         <w:t xml:space="preserve">gatk --java-options "-Xmx14g" HaplotypeCaller \</w:t>
       </w:r>
     </w:p>
     <w:p>
       <w:pPr>
-        <w:shd w:fill="F2F2F2" w:color="auto" w:val="clear"/>
+        <w:pStyle w:val="CodeBlock"/>
         <w:spacing w:after="0" w:before="0"/>
-        <w:ind w:left="144" w:right="144"/>
-      </w:pPr>
-      <w:r>
-        <w:rPr>
-          <w:rFonts w:ascii="Consolas" w:cs="Consolas" w:eastAsia="Consolas" w:hAnsi="Consolas"/>
-          <w:sz w:val="16"/>
-          <w:szCs w:val="16"/>
-        </w:rPr>
+      </w:pPr>
+      <w:r>
         <w:t xml:space="preserve">    -R ${REF} -I ${BAM} -O ${SM}.g.vcf.gz \</w:t>
       </w:r>
     </w:p>
     <w:p>
       <w:pPr>
-        <w:shd w:fill="F2F2F2" w:color="auto" w:val="clear"/>
+        <w:pStyle w:val="CodeBlock"/>
         <w:spacing w:after="0" w:before="0"/>
-        <w:ind w:left="144" w:right="144"/>
-      </w:pPr>
-      <w:r>
-        <w:rPr>
-          <w:rFonts w:ascii="Consolas" w:cs="Consolas" w:eastAsia="Consolas" w:hAnsi="Consolas"/>
-          <w:sz w:val="16"/>
-          <w:szCs w:val="16"/>
-        </w:rPr>
+      </w:pPr>
+      <w:r>
         <w:t xml:space="preserve">    -ERC GVCF \</w:t>
       </w:r>
     </w:p>
     <w:p>
       <w:pPr>
-        <w:shd w:fill="F2F2F2" w:color="auto" w:val="clear"/>
+        <w:pStyle w:val="CodeBlock"/>
         <w:spacing w:after="0" w:before="0"/>
-        <w:ind w:left="144" w:right="144"/>
-      </w:pPr>
-      <w:r>
-        <w:rPr>
-          <w:rFonts w:ascii="Consolas" w:cs="Consolas" w:eastAsia="Consolas" w:hAnsi="Consolas"/>
-          <w:sz w:val="16"/>
-          <w:szCs w:val="16"/>
-        </w:rPr>
+      </w:pPr>
+      <w:r>
         <w:t xml:space="preserve">    --pcr-indel-model NONE \</w:t>
       </w:r>
     </w:p>
     <w:p>
       <w:pPr>
-        <w:shd w:fill="F2F2F2" w:color="auto" w:val="clear"/>
+        <w:pStyle w:val="CodeBlock"/>
         <w:spacing w:after="0" w:before="0"/>
-        <w:ind w:left="144" w:right="144"/>
-      </w:pPr>
-      <w:r>
-        <w:rPr>
-          <w:rFonts w:ascii="Consolas" w:cs="Consolas" w:eastAsia="Consolas" w:hAnsi="Consolas"/>
-          <w:sz w:val="16"/>
-          <w:szCs w:val="16"/>
-        </w:rPr>
+      </w:pPr>
+      <w:r>
         <w:t xml:space="preserve">    -G StandardAnnotation -G StandardHCAnnotation -G AS_StandardAnnotation \</w:t>
       </w:r>
     </w:p>
     <w:p>
       <w:pPr>
-        <w:shd w:fill="F2F2F2" w:color="auto" w:val="clear"/>
+        <w:pStyle w:val="CodeBlock"/>
         <w:spacing w:after="0" w:before="0"/>
-        <w:ind w:left="144" w:right="144"/>
-      </w:pPr>
-      <w:r>
-        <w:rPr>
-          <w:rFonts w:ascii="Consolas" w:cs="Consolas" w:eastAsia="Consolas" w:hAnsi="Consolas"/>
-          <w:sz w:val="16"/>
-          <w:szCs w:val="16"/>
-        </w:rPr>
+      </w:pPr>
+      <w:r>
         <w:t xml:space="preserve">    -A StrandBiasBySample \</w:t>
       </w:r>
     </w:p>
     <w:p>
       <w:pPr>
-        <w:shd w:fill="F2F2F2" w:color="auto" w:val="clear"/>
+        <w:pStyle w:val="CodeBlock"/>
         <w:spacing w:after="0" w:before="0"/>
-        <w:ind w:left="144" w:right="144"/>
-      </w:pPr>
-      <w:r>
-        <w:rPr>
-          <w:rFonts w:ascii="Consolas" w:cs="Consolas" w:eastAsia="Consolas" w:hAnsi="Consolas"/>
-          <w:sz w:val="16"/>
-          <w:szCs w:val="16"/>
-        </w:rPr>
+      </w:pPr>
+      <w:r>
         <w:t xml:space="preserve">    --max-alternate-alleles 6 \</w:t>
       </w:r>
     </w:p>
     <w:p>
       <w:pPr>
-        <w:shd w:fill="F2F2F2" w:color="auto" w:val="clear"/>
+        <w:pStyle w:val="CodeBlock"/>
         <w:spacing w:after="140" w:before="0"/>
-        <w:ind w:left="144" w:right="144"/>
-      </w:pPr>
-      <w:r>
-        <w:rPr>
-          <w:rFonts w:ascii="Consolas" w:cs="Consolas" w:eastAsia="Consolas" w:hAnsi="Consolas"/>
-          <w:sz w:val="16"/>
-          <w:szCs w:val="16"/>
-        </w:rPr>
+      </w:pPr>
+      <w:r>
         <w:t xml:space="preserve">    -L ${INTERVALS}</w:t>
       </w:r>
     </w:p>
     <w:p>
       <w:pPr>
+        <w:pStyle w:val="Note"/>
         <w:pBdr>
           <w:left w:val="single" w:color="E0A030" w:sz="18" w:space="6"/>
         </w:pBdr>
@@ -6855,9 +6766,7 @@
       </w:r>
       <w:r>
         <w:rPr>
-          <w:rFonts w:ascii="Consolas" w:cs="Consolas" w:eastAsia="Consolas" w:hAnsi="Consolas"/>
-          <w:sz w:val="18"/>
-          <w:szCs w:val="18"/>
+          <w:rStyle w:val="InlineCode"/>
         </w:rPr>
         <w:t xml:space="preserve">--output-mode EMIT_VARIANTS_ONLY</w:t>
       </w:r>
@@ -6866,9 +6775,7 @@
       </w:r>
       <w:r>
         <w:rPr>
-          <w:rFonts w:ascii="Consolas" w:cs="Consolas" w:eastAsia="Consolas" w:hAnsi="Consolas"/>
-          <w:sz w:val="18"/>
-          <w:szCs w:val="18"/>
+          <w:rStyle w:val="InlineCode"/>
         </w:rPr>
         <w:t xml:space="preserve">StrandBiasBySample</w:t>
       </w:r>
@@ -6885,9 +6792,7 @@
       </w:r>
       <w:r>
         <w:rPr>
-          <w:rFonts w:ascii="Consolas" w:cs="Consolas" w:eastAsia="Consolas" w:hAnsi="Consolas"/>
-          <w:sz w:val="18"/>
-          <w:szCs w:val="18"/>
+          <w:rStyle w:val="InlineCode"/>
         </w:rPr>
         <w:t xml:space="preserve">--sample-ploidy 1</w:t>
       </w:r>
@@ -6896,9 +6801,7 @@
       </w:r>
       <w:r>
         <w:rPr>
-          <w:rFonts w:ascii="Consolas" w:cs="Consolas" w:eastAsia="Consolas" w:hAnsi="Consolas"/>
-          <w:sz w:val="18"/>
-          <w:szCs w:val="18"/>
+          <w:rStyle w:val="InlineCode"/>
         </w:rPr>
         <w:t xml:space="preserve">trio-dnm</w:t>
       </w:r>
@@ -6917,76 +6820,46 @@
     </w:p>
     <w:p>
       <w:pPr>
-        <w:shd w:fill="F2F2F2" w:color="auto" w:val="clear"/>
+        <w:pStyle w:val="CodeBlock"/>
         <w:spacing w:after="0" w:before="80"/>
-        <w:ind w:left="144" w:right="144"/>
-      </w:pPr>
-      <w:r>
-        <w:rPr>
-          <w:rFonts w:ascii="Consolas" w:cs="Consolas" w:eastAsia="Consolas" w:hAnsi="Consolas"/>
-          <w:sz w:val="16"/>
-          <w:szCs w:val="16"/>
-        </w:rPr>
+      </w:pPr>
+      <w:r>
         <w:t xml:space="preserve">gatk GenomicsDBImport -V proband.g.vcf.gz -V father.g.vcf.gz -V mother.g.vcf.gz \</w:t>
       </w:r>
     </w:p>
     <w:p>
       <w:pPr>
-        <w:shd w:fill="F2F2F2" w:color="auto" w:val="clear"/>
+        <w:pStyle w:val="CodeBlock"/>
         <w:spacing w:after="0" w:before="0"/>
-        <w:ind w:left="144" w:right="144"/>
-      </w:pPr>
-      <w:r>
-        <w:rPr>
-          <w:rFonts w:ascii="Consolas" w:cs="Consolas" w:eastAsia="Consolas" w:hAnsi="Consolas"/>
-          <w:sz w:val="16"/>
-          <w:szCs w:val="16"/>
-        </w:rPr>
+      </w:pPr>
+      <w:r>
         <w:t xml:space="preserve">    --genomicsdb-workspace-path trio_db -L ${INTERVALS} --merge-input-intervals</w:t>
       </w:r>
     </w:p>
     <w:p>
       <w:pPr>
-        <w:shd w:fill="F2F2F2" w:color="auto" w:val="clear"/>
+        <w:pStyle w:val="CodeBlock"/>
         <w:spacing w:after="0" w:before="0"/>
-        <w:ind w:left="144" w:right="144"/>
-      </w:pPr>
-      <w:r>
-        <w:rPr>
-          <w:rFonts w:ascii="Consolas" w:cs="Consolas" w:eastAsia="Consolas" w:hAnsi="Consolas"/>
-          <w:sz w:val="16"/>
-          <w:szCs w:val="16"/>
-        </w:rPr>
+      </w:pPr>
+      <w:r>
         <w:t xml:space="preserve">gatk GenotypeGVCFs -R ${REF} -V gendb://trio_db -O trio.vcf.gz \</w:t>
       </w:r>
     </w:p>
     <w:p>
       <w:pPr>
-        <w:shd w:fill="F2F2F2" w:color="auto" w:val="clear"/>
+        <w:pStyle w:val="CodeBlock"/>
         <w:spacing w:after="0" w:before="0"/>
-        <w:ind w:left="144" w:right="144"/>
-      </w:pPr>
-      <w:r>
-        <w:rPr>
-          <w:rFonts w:ascii="Consolas" w:cs="Consolas" w:eastAsia="Consolas" w:hAnsi="Consolas"/>
-          <w:sz w:val="16"/>
-          <w:szCs w:val="16"/>
-        </w:rPr>
+      </w:pPr>
+      <w:r>
         <w:t xml:space="preserve">    -G StandardAnnotation -G AS_StandardAnnotation \</w:t>
       </w:r>
     </w:p>
     <w:p>
       <w:pPr>
-        <w:shd w:fill="F2F2F2" w:color="auto" w:val="clear"/>
+        <w:pStyle w:val="CodeBlock"/>
         <w:spacing w:after="140" w:before="0"/>
-        <w:ind w:left="144" w:right="144"/>
-      </w:pPr>
-      <w:r>
-        <w:rPr>
-          <w:rFonts w:ascii="Consolas" w:cs="Consolas" w:eastAsia="Consolas" w:hAnsi="Consolas"/>
-          <w:sz w:val="16"/>
-          <w:szCs w:val="16"/>
-        </w:rPr>
+      </w:pPr>
+      <w:r>
         <w:t xml:space="preserve">    --only-output-calls-starting-in-intervals -L ${INTERVALS}</w:t>
       </w:r>
     </w:p>
@@ -7217,9 +7090,7 @@
       </w:r>
       <w:r>
         <w:rPr>
-          <w:rFonts w:ascii="Consolas" w:cs="Consolas" w:eastAsia="Consolas" w:hAnsi="Consolas"/>
-          <w:sz w:val="18"/>
-          <w:szCs w:val="18"/>
+          <w:rStyle w:val="InlineCode"/>
         </w:rPr>
         <w:t xml:space="preserve">bcftools norm -m -any -f ref.fa</w:t>
       </w:r>
@@ -7265,61 +7136,37 @@
     </w:p>
     <w:p>
       <w:pPr>
-        <w:shd w:fill="F2F2F2" w:color="auto" w:val="clear"/>
+        <w:pStyle w:val="CodeBlock"/>
         <w:spacing w:after="0" w:before="80"/>
-        <w:ind w:left="144" w:right="144"/>
-      </w:pPr>
-      <w:r>
-        <w:rPr>
-          <w:rFonts w:ascii="Consolas" w:cs="Consolas" w:eastAsia="Consolas" w:hAnsi="Consolas"/>
-          <w:sz w:val="16"/>
-          <w:szCs w:val="16"/>
-        </w:rPr>
+      </w:pPr>
+      <w:r>
         <w:t xml:space="preserve">gatk CalculateGenotypePosteriors -V trio.filtered.vcf.gz -ped trio.ped \</w:t>
       </w:r>
     </w:p>
     <w:p>
       <w:pPr>
-        <w:shd w:fill="F2F2F2" w:color="auto" w:val="clear"/>
+        <w:pStyle w:val="CodeBlock"/>
         <w:spacing w:after="0" w:before="0"/>
-        <w:ind w:left="144" w:right="144"/>
-      </w:pPr>
-      <w:r>
-        <w:rPr>
-          <w:rFonts w:ascii="Consolas" w:cs="Consolas" w:eastAsia="Consolas" w:hAnsi="Consolas"/>
-          <w:sz w:val="16"/>
-          <w:szCs w:val="16"/>
-        </w:rPr>
+      </w:pPr>
+      <w:r>
         <w:t xml:space="preserve">    --skip-population-priors -O trio.cgp.vcf.gz</w:t>
       </w:r>
     </w:p>
     <w:p>
       <w:pPr>
-        <w:shd w:fill="F2F2F2" w:color="auto" w:val="clear"/>
+        <w:pStyle w:val="CodeBlock"/>
         <w:spacing w:after="0" w:before="0"/>
-        <w:ind w:left="144" w:right="144"/>
-      </w:pPr>
-      <w:r>
-        <w:rPr>
-          <w:rFonts w:ascii="Consolas" w:cs="Consolas" w:eastAsia="Consolas" w:hAnsi="Consolas"/>
-          <w:sz w:val="16"/>
-          <w:szCs w:val="16"/>
-        </w:rPr>
+      </w:pPr>
+      <w:r>
         <w:t xml:space="preserve">gatk VariantAnnotator -R ${REF} -V trio.cgp.vcf.gz -ped trio.ped \</w:t>
       </w:r>
     </w:p>
     <w:p>
       <w:pPr>
-        <w:shd w:fill="F2F2F2" w:color="auto" w:val="clear"/>
+        <w:pStyle w:val="CodeBlock"/>
         <w:spacing w:after="140" w:before="0"/>
-        <w:ind w:left="144" w:right="144"/>
-      </w:pPr>
-      <w:r>
-        <w:rPr>
-          <w:rFonts w:ascii="Consolas" w:cs="Consolas" w:eastAsia="Consolas" w:hAnsi="Consolas"/>
-          <w:sz w:val="16"/>
-          <w:szCs w:val="16"/>
-        </w:rPr>
+      </w:pPr>
+      <w:r>
         <w:t xml:space="preserve">    -A PossibleDeNovo -O trio.cgp.dn.vcf.gz      # writes hiConfDeNovo / loConfDeNovo</w:t>
       </w:r>
     </w:p>
@@ -7338,9 +7185,7 @@
       </w:pPr>
       <w:r>
         <w:rPr>
-          <w:rFonts w:ascii="Consolas" w:cs="Consolas" w:eastAsia="Consolas" w:hAnsi="Consolas"/>
-          <w:sz w:val="18"/>
-          <w:szCs w:val="18"/>
+          <w:rStyle w:val="InlineCode"/>
         </w:rPr>
         <w:t xml:space="preserve">bcftools mpileup -a AD,DP</w:t>
       </w:r>
@@ -7349,9 +7194,7 @@
       </w:r>
       <w:r>
         <w:rPr>
-          <w:rFonts w:ascii="Consolas" w:cs="Consolas" w:eastAsia="Consolas" w:hAnsi="Consolas"/>
-          <w:sz w:val="18"/>
-          <w:szCs w:val="18"/>
+          <w:rStyle w:val="InlineCode"/>
         </w:rPr>
         <w:t xml:space="preserve">dng dnm auto --ped trio.ped --bcf cand.bcf</w:t>
       </w:r>
@@ -7360,9 +7203,7 @@
       </w:r>
       <w:r>
         <w:rPr>
-          <w:rFonts w:ascii="Consolas" w:cs="Consolas" w:eastAsia="Consolas" w:hAnsi="Consolas"/>
-          <w:sz w:val="18"/>
-          <w:szCs w:val="18"/>
+          <w:rStyle w:val="InlineCode"/>
         </w:rPr>
         <w:t xml:space="preserve">pp_dnm ≥ 0.5</w:t>
       </w:r>
@@ -7371,9 +7212,7 @@
       </w:r>
       <w:r>
         <w:rPr>
-          <w:rFonts w:ascii="Consolas" w:cs="Consolas" w:eastAsia="Consolas" w:hAnsi="Consolas"/>
-          <w:sz w:val="18"/>
-          <w:szCs w:val="18"/>
+          <w:rStyle w:val="InlineCode"/>
         </w:rPr>
         <w:t xml:space="preserve">bin/dng2tsv.py</w:t>
       </w:r>
@@ -7396,9 +7235,7 @@
       </w:pPr>
       <w:r>
         <w:rPr>
-          <w:rFonts w:ascii="Consolas" w:cs="Consolas" w:eastAsia="Consolas" w:hAnsi="Consolas"/>
-          <w:sz w:val="18"/>
-          <w:szCs w:val="18"/>
+          <w:rStyle w:val="InlineCode"/>
         </w:rPr>
         <w:t xml:space="preserve">triodenovo --ped trio.ped --in_vcf cand.vcf --out_vcf out.vcf --minDQ 7</w:t>
       </w:r>
@@ -7434,9 +7271,7 @@
       </w:r>
       <w:r>
         <w:rPr>
-          <w:rFonts w:ascii="Consolas" w:cs="Consolas" w:eastAsia="Consolas" w:hAnsi="Consolas"/>
-          <w:sz w:val="18"/>
-          <w:szCs w:val="18"/>
+          <w:rStyle w:val="InlineCode"/>
         </w:rPr>
         <w:t xml:space="preserve">--model_type</w:t>
       </w:r>
@@ -7462,9 +7297,7 @@
       </w:r>
       <w:r>
         <w:rPr>
-          <w:rFonts w:ascii="Consolas" w:cs="Consolas" w:eastAsia="Consolas" w:hAnsi="Consolas"/>
-          <w:sz w:val="18"/>
-          <w:szCs w:val="18"/>
+          <w:rStyle w:val="InlineCode"/>
         </w:rPr>
         <w:t xml:space="preserve">N_CALLERS</w:t>
       </w:r>
@@ -7837,9 +7670,7 @@
       </w:pPr>
       <w:r>
         <w:rPr>
-          <w:rFonts w:ascii="Consolas" w:cs="Consolas" w:eastAsia="Consolas" w:hAnsi="Consolas"/>
-          <w:sz w:val="18"/>
-          <w:szCs w:val="18"/>
+          <w:rStyle w:val="InlineCode"/>
         </w:rPr>
         <w:t xml:space="preserve">trio-dnm call</w:t>
       </w:r>
@@ -7858,9 +7689,7 @@
       </w:r>
       <w:r>
         <w:rPr>
-          <w:rFonts w:ascii="Consolas" w:cs="Consolas" w:eastAsia="Consolas" w:hAnsi="Consolas"/>
-          <w:sz w:val="18"/>
-          <w:szCs w:val="18"/>
+          <w:rStyle w:val="InlineCode"/>
         </w:rPr>
         <w:t xml:space="preserve">candidates.tsv</w:t>
       </w:r>
@@ -7869,9 +7698,7 @@
       </w:r>
       <w:r>
         <w:rPr>
-          <w:rFonts w:ascii="Consolas" w:cs="Consolas" w:eastAsia="Consolas" w:hAnsi="Consolas"/>
-          <w:sz w:val="18"/>
-          <w:szCs w:val="18"/>
+          <w:rStyle w:val="InlineCode"/>
         </w:rPr>
         <w:t xml:space="preserve">call_summary.json</w:t>
       </w:r>
@@ -7880,9 +7707,7 @@
       </w:r>
       <w:r>
         <w:rPr>
-          <w:rFonts w:ascii="Consolas" w:cs="Consolas" w:eastAsia="Consolas" w:hAnsi="Consolas"/>
-          <w:sz w:val="18"/>
-          <w:szCs w:val="18"/>
+          <w:rStyle w:val="InlineCode"/>
         </w:rPr>
         <w:t xml:space="preserve">--data-type wes|panel</w:t>
       </w:r>
@@ -9229,9 +9054,7 @@
       </w:r>
       <w:r>
         <w:rPr>
-          <w:rFonts w:ascii="Consolas" w:cs="Consolas" w:eastAsia="Consolas" w:hAnsi="Consolas"/>
-          <w:sz w:val="18"/>
-          <w:szCs w:val="18"/>
+          <w:rStyle w:val="InlineCode"/>
         </w:rPr>
         <w:t xml:space="preserve">POP_AF_RESCUED_BY_CLINVAR</w:t>
       </w:r>
@@ -9280,9 +9103,7 @@
       </w:pPr>
       <w:r>
         <w:rPr>
-          <w:rFonts w:ascii="Consolas" w:cs="Consolas" w:eastAsia="Consolas" w:hAnsi="Consolas"/>
-          <w:sz w:val="18"/>
-          <w:szCs w:val="18"/>
+          <w:rStyle w:val="InlineCode"/>
         </w:rPr>
         <w:t xml:space="preserve">trio-dnm</w:t>
       </w:r>
@@ -9292,76 +9113,46 @@
     </w:p>
     <w:p>
       <w:pPr>
-        <w:shd w:fill="F2F2F2" w:color="auto" w:val="clear"/>
+        <w:pStyle w:val="CodeBlock"/>
         <w:spacing w:after="0" w:before="80"/>
-        <w:ind w:left="144" w:right="144"/>
-      </w:pPr>
-      <w:r>
-        <w:rPr>
-          <w:rFonts w:ascii="Consolas" w:cs="Consolas" w:eastAsia="Consolas" w:hAnsi="Consolas"/>
-          <w:sz w:val="16"/>
-          <w:szCs w:val="16"/>
-        </w:rPr>
+      </w:pPr>
+      <w:r>
         <w:t xml:space="preserve">P(DNM | D) = Σ_{g_c&gt;0} P(D_f|0) P(D_m|0) P(D_c|g_c) π(0)π(0) T(g_c|0,0)  /  Σ_{g_f,g_m,g_c} (same terms)</w:t>
       </w:r>
     </w:p>
     <w:p>
       <w:pPr>
-        <w:shd w:fill="F2F2F2" w:color="auto" w:val="clear"/>
+        <w:pStyle w:val="CodeBlock"/>
         <w:spacing w:after="0" w:before="0"/>
-        <w:ind w:left="144" w:right="144"/>
-      </w:pPr>
-      <w:r>
-        <w:rPr>
-          <w:rFonts w:ascii="Consolas" w:cs="Consolas" w:eastAsia="Consolas" w:hAnsi="Consolas"/>
-          <w:sz w:val="16"/>
-          <w:szCs w:val="16"/>
-        </w:rPr>
+      </w:pPr>
+      <w:r>
         <w:t xml:space="preserve"> </w:t>
       </w:r>
     </w:p>
     <w:p>
       <w:pPr>
-        <w:shd w:fill="F2F2F2" w:color="auto" w:val="clear"/>
+        <w:pStyle w:val="CodeBlock"/>
         <w:spacing w:after="0" w:before="0"/>
-        <w:ind w:left="144" w:right="144"/>
-      </w:pPr>
-      <w:r>
-        <w:rPr>
-          <w:rFonts w:ascii="Consolas" w:cs="Consolas" w:eastAsia="Consolas" w:hAnsi="Consolas"/>
-          <w:sz w:val="16"/>
-          <w:szCs w:val="16"/>
-        </w:rPr>
+      </w:pPr>
+      <w:r>
         <w:t xml:space="preserve">π(g)          Hardy–Weinberg prior with q = max(gnomAD AF, 1e-4)   (floor keeps absent sites conservative)</w:t>
       </w:r>
     </w:p>
     <w:p>
       <w:pPr>
-        <w:shd w:fill="F2F2F2" w:color="auto" w:val="clear"/>
+        <w:pStyle w:val="CodeBlock"/>
         <w:spacing w:after="0" w:before="0"/>
-        <w:ind w:left="144" w:right="144"/>
-      </w:pPr>
-      <w:r>
-        <w:rPr>
-          <w:rFonts w:ascii="Consolas" w:cs="Consolas" w:eastAsia="Consolas" w:hAnsi="Consolas"/>
-          <w:sz w:val="16"/>
-          <w:szCs w:val="16"/>
-        </w:rPr>
+      </w:pPr>
+      <w:r>
         <w:t xml:space="preserve">T(g_c|g_f,g_m) Mendelian transmission with per-allele mutation μ = 1.2e-8 (SNV) / 1e-9 (indel)</w:t>
       </w:r>
     </w:p>
     <w:p>
       <w:pPr>
-        <w:shd w:fill="F2F2F2" w:color="auto" w:val="clear"/>
+        <w:pStyle w:val="CodeBlock"/>
         <w:spacing w:after="140" w:before="0"/>
-        <w:ind w:left="144" w:right="144"/>
-      </w:pPr>
-      <w:r>
-        <w:rPr>
-          <w:rFonts w:ascii="Consolas" w:cs="Consolas" w:eastAsia="Consolas" w:hAnsi="Consolas"/>
-          <w:sz w:val="16"/>
-          <w:szCs w:val="16"/>
-        </w:rPr>
+      </w:pPr>
+      <w:r>
         <w:t xml:space="preserve">ploidy         taken from the region table in §7.1 (hemizygous child: single transmitting parent)</w:t>
       </w:r>
     </w:p>
@@ -9481,9 +9272,7 @@
       </w:r>
       <w:r>
         <w:rPr>
-          <w:rFonts w:ascii="Consolas" w:cs="Consolas" w:eastAsia="Consolas" w:hAnsi="Consolas"/>
-          <w:sz w:val="18"/>
-          <w:szCs w:val="18"/>
+          <w:rStyle w:val="InlineCode"/>
         </w:rPr>
         <w:t xml:space="preserve">CLUSTERED_DNM</w:t>
       </w:r>
@@ -9509,9 +9298,7 @@
       </w:r>
       <w:r>
         <w:rPr>
-          <w:rFonts w:ascii="Consolas" w:cs="Consolas" w:eastAsia="Consolas" w:hAnsi="Consolas"/>
-          <w:sz w:val="18"/>
-          <w:szCs w:val="18"/>
+          <w:rStyle w:val="InlineCode"/>
         </w:rPr>
         <w:t xml:space="preserve">trio-dnm annotate</w:t>
       </w:r>
@@ -10168,9 +9955,7 @@
       </w:r>
       <w:r>
         <w:rPr>
-          <w:rFonts w:ascii="Consolas" w:cs="Consolas" w:eastAsia="Consolas" w:hAnsi="Consolas"/>
-          <w:sz w:val="18"/>
-          <w:szCs w:val="18"/>
+          <w:rStyle w:val="InlineCode"/>
         </w:rPr>
         <w:t xml:space="preserve">Refine</w:t>
       </w:r>
@@ -10271,9 +10056,7 @@
       </w:r>
       <w:r>
         <w:rPr>
-          <w:rFonts w:ascii="Consolas" w:cs="Consolas" w:eastAsia="Consolas" w:hAnsi="Consolas"/>
-          <w:sz w:val="18"/>
-          <w:szCs w:val="18"/>
+          <w:rStyle w:val="InlineCode"/>
         </w:rPr>
         <w:t xml:space="preserve">parental_mosaic</w:t>
       </w:r>
@@ -10318,223 +10101,137 @@
     </w:p>
     <w:p>
       <w:pPr>
-        <w:shd w:fill="F2F2F2" w:color="auto" w:val="clear"/>
+        <w:pStyle w:val="CodeBlock"/>
         <w:spacing w:after="0" w:before="80"/>
-        <w:ind w:left="144" w:right="144"/>
+      </w:pPr>
+      <w:r>
+        <w:t xml:space="preserve">vep --input_file dnm.vcf --output_file dnm.vep.vcf --vcf --offline --cache \</w:t>
+      </w:r>
+    </w:p>
+    <w:p>
+      <w:pPr>
+        <w:pStyle w:val="CodeBlock"/>
+        <w:spacing w:after="0" w:before="0"/>
+      </w:pPr>
+      <w:r>
+        <w:t xml:space="preserve">    --dir_cache ${VEP_CACHE} --dir_plugins ${VEP_PLUGINS} --assembly GRCh38 --fasta ${REF} \</w:t>
+      </w:r>
+    </w:p>
+    <w:p>
+      <w:pPr>
+        <w:pStyle w:val="CodeBlock"/>
+        <w:spacing w:after="0" w:before="0"/>
+      </w:pPr>
+      <w:r>
+        <w:t xml:space="preserve">    --everything --mane --flag_pick_allele_gene \</w:t>
+      </w:r>
+    </w:p>
+    <w:p>
+      <w:pPr>
+        <w:pStyle w:val="CodeBlock"/>
+        <w:spacing w:after="0" w:before="0"/>
+      </w:pPr>
+      <w:r>
+        <w:t xml:space="preserve">    --pick_order mane_select,mane_plus_clinical,canonical,appris,tsl,biotype,ccds,rank,length \</w:t>
+      </w:r>
+    </w:p>
+    <w:p>
+      <w:pPr>
+        <w:pStyle w:val="CodeBlock"/>
+        <w:spacing w:after="0" w:before="0"/>
+      </w:pPr>
+      <w:r>
+        <w:t xml:space="preserve">    --plugin LoF,loftee_path:${LOFTEE},human_ancestor_fa:${ANC},conservation_file:${LOFTEE_SQL} \</w:t>
+      </w:r>
+    </w:p>
+    <w:p>
+      <w:pPr>
+        <w:pStyle w:val="CodeBlock"/>
+        <w:spacing w:after="0" w:before="0"/>
+      </w:pPr>
+      <w:r>
+        <w:t xml:space="preserve">    --plugin CADD,snv=${CADD_SNV},indels=${CADD_INDEL} \</w:t>
+      </w:r>
+    </w:p>
+    <w:p>
+      <w:pPr>
+        <w:pStyle w:val="CodeBlock"/>
+        <w:spacing w:after="0" w:before="0"/>
+      </w:pPr>
+      <w:r>
+        <w:t xml:space="preserve">    --plugin REVEL,file=${REVEL} \</w:t>
+      </w:r>
+    </w:p>
+    <w:p>
+      <w:pPr>
+        <w:pStyle w:val="CodeBlock"/>
+        <w:spacing w:after="0" w:before="0"/>
+      </w:pPr>
+      <w:r>
+        <w:t xml:space="preserve">    --plugin AlphaMissense,file=${AM} \</w:t>
+      </w:r>
+    </w:p>
+    <w:p>
+      <w:pPr>
+        <w:pStyle w:val="CodeBlock"/>
+        <w:spacing w:after="0" w:before="0"/>
+      </w:pPr>
+      <w:r>
+        <w:t xml:space="preserve">    --plugin SpliceAI,snv=${SAI_SNV},indel=${SAI_INDEL},cutoff=0.0 \</w:t>
+      </w:r>
+    </w:p>
+    <w:p>
+      <w:pPr>
+        <w:pStyle w:val="CodeBlock"/>
+        <w:spacing w:after="0" w:before="0"/>
+      </w:pPr>
+      <w:r>
+        <w:t xml:space="preserve">    --plugin dbNSFP,${DBNSFP},BayesDel_noAF_score,PrimateAI_score,ESM1b_score,EVE_score,MetaRNN_score,phyloP100way_vertebrate,GERP++_RS \</w:t>
+      </w:r>
+    </w:p>
+    <w:p>
+      <w:pPr>
+        <w:pStyle w:val="CodeBlock"/>
+        <w:spacing w:after="0" w:before="0"/>
+      </w:pPr>
+      <w:r>
+        <w:t xml:space="preserve">    --plugin UTRAnnotator,file=${UTR} --plugin NMD \</w:t>
+      </w:r>
+    </w:p>
+    <w:p>
+      <w:pPr>
+        <w:pStyle w:val="CodeBlock"/>
+        <w:spacing w:after="0" w:before="0"/>
+      </w:pPr>
+      <w:r>
+        <w:t xml:space="preserve">    --custom file=${GNOMAD},short_name=gnomADv4,format=vcf,type=exact,coords=0,fields=AF_joint%AF_joint_grpmax%nhomalt_joint \</w:t>
+      </w:r>
+    </w:p>
+    <w:p>
+      <w:pPr>
+        <w:pStyle w:val="CodeBlock"/>
+        <w:spacing w:after="0" w:before="0"/>
+      </w:pPr>
+      <w:r>
+        <w:t xml:space="preserve">    --custom file=${CLINVAR},short_name=ClinVar,format=vcf,type=exact,coords=0,fields=CLNSIG%CLNREVSTAT%CLNDN \</w:t>
+      </w:r>
+    </w:p>
+    <w:p>
+      <w:pPr>
+        <w:pStyle w:val="CodeBlock"/>
+        <w:spacing w:after="140" w:before="0"/>
+      </w:pPr>
+      <w:r>
+        <w:t xml:space="preserve">    --custom file=${CCRE_BED},short_name=ENCODE_cCRE,format=bed,type=overlap</w:t>
+      </w:r>
+    </w:p>
+    <w:p>
+      <w:pPr>
+        <w:spacing w:after="120"/>
       </w:pPr>
       <w:r>
         <w:rPr>
-          <w:rFonts w:ascii="Consolas" w:cs="Consolas" w:eastAsia="Consolas" w:hAnsi="Consolas"/>
-          <w:sz w:val="16"/>
-          <w:szCs w:val="16"/>
-        </w:rPr>
-        <w:t xml:space="preserve">vep --input_file dnm.vcf --output_file dnm.vep.vcf --vcf --offline --cache \</w:t>
-      </w:r>
-    </w:p>
-    <w:p>
-      <w:pPr>
-        <w:shd w:fill="F2F2F2" w:color="auto" w:val="clear"/>
-        <w:spacing w:after="0" w:before="0"/>
-        <w:ind w:left="144" w:right="144"/>
-      </w:pPr>
-      <w:r>
-        <w:rPr>
-          <w:rFonts w:ascii="Consolas" w:cs="Consolas" w:eastAsia="Consolas" w:hAnsi="Consolas"/>
-          <w:sz w:val="16"/>
-          <w:szCs w:val="16"/>
-        </w:rPr>
-        <w:t xml:space="preserve">    --dir_cache ${VEP_CACHE} --dir_plugins ${VEP_PLUGINS} --assembly GRCh38 --fasta ${REF} \</w:t>
-      </w:r>
-    </w:p>
-    <w:p>
-      <w:pPr>
-        <w:shd w:fill="F2F2F2" w:color="auto" w:val="clear"/>
-        <w:spacing w:after="0" w:before="0"/>
-        <w:ind w:left="144" w:right="144"/>
-      </w:pPr>
-      <w:r>
-        <w:rPr>
-          <w:rFonts w:ascii="Consolas" w:cs="Consolas" w:eastAsia="Consolas" w:hAnsi="Consolas"/>
-          <w:sz w:val="16"/>
-          <w:szCs w:val="16"/>
-        </w:rPr>
-        <w:t xml:space="preserve">    --everything --mane --flag_pick_allele_gene \</w:t>
-      </w:r>
-    </w:p>
-    <w:p>
-      <w:pPr>
-        <w:shd w:fill="F2F2F2" w:color="auto" w:val="clear"/>
-        <w:spacing w:after="0" w:before="0"/>
-        <w:ind w:left="144" w:right="144"/>
-      </w:pPr>
-      <w:r>
-        <w:rPr>
-          <w:rFonts w:ascii="Consolas" w:cs="Consolas" w:eastAsia="Consolas" w:hAnsi="Consolas"/>
-          <w:sz w:val="16"/>
-          <w:szCs w:val="16"/>
-        </w:rPr>
-        <w:t xml:space="preserve">    --pick_order mane_select,mane_plus_clinical,canonical,appris,tsl,biotype,ccds,rank,length \</w:t>
-      </w:r>
-    </w:p>
-    <w:p>
-      <w:pPr>
-        <w:shd w:fill="F2F2F2" w:color="auto" w:val="clear"/>
-        <w:spacing w:after="0" w:before="0"/>
-        <w:ind w:left="144" w:right="144"/>
-      </w:pPr>
-      <w:r>
-        <w:rPr>
-          <w:rFonts w:ascii="Consolas" w:cs="Consolas" w:eastAsia="Consolas" w:hAnsi="Consolas"/>
-          <w:sz w:val="16"/>
-          <w:szCs w:val="16"/>
-        </w:rPr>
-        <w:t xml:space="preserve">    --plugin LoF,loftee_path:${LOFTEE},human_ancestor_fa:${ANC},conservation_file:${LOFTEE_SQL} \</w:t>
-      </w:r>
-    </w:p>
-    <w:p>
-      <w:pPr>
-        <w:shd w:fill="F2F2F2" w:color="auto" w:val="clear"/>
-        <w:spacing w:after="0" w:before="0"/>
-        <w:ind w:left="144" w:right="144"/>
-      </w:pPr>
-      <w:r>
-        <w:rPr>
-          <w:rFonts w:ascii="Consolas" w:cs="Consolas" w:eastAsia="Consolas" w:hAnsi="Consolas"/>
-          <w:sz w:val="16"/>
-          <w:szCs w:val="16"/>
-        </w:rPr>
-        <w:t xml:space="preserve">    --plugin CADD,snv=${CADD_SNV},indels=${CADD_INDEL} \</w:t>
-      </w:r>
-    </w:p>
-    <w:p>
-      <w:pPr>
-        <w:shd w:fill="F2F2F2" w:color="auto" w:val="clear"/>
-        <w:spacing w:after="0" w:before="0"/>
-        <w:ind w:left="144" w:right="144"/>
-      </w:pPr>
-      <w:r>
-        <w:rPr>
-          <w:rFonts w:ascii="Consolas" w:cs="Consolas" w:eastAsia="Consolas" w:hAnsi="Consolas"/>
-          <w:sz w:val="16"/>
-          <w:szCs w:val="16"/>
-        </w:rPr>
-        <w:t xml:space="preserve">    --plugin REVEL,file=${REVEL} \</w:t>
-      </w:r>
-    </w:p>
-    <w:p>
-      <w:pPr>
-        <w:shd w:fill="F2F2F2" w:color="auto" w:val="clear"/>
-        <w:spacing w:after="0" w:before="0"/>
-        <w:ind w:left="144" w:right="144"/>
-      </w:pPr>
-      <w:r>
-        <w:rPr>
-          <w:rFonts w:ascii="Consolas" w:cs="Consolas" w:eastAsia="Consolas" w:hAnsi="Consolas"/>
-          <w:sz w:val="16"/>
-          <w:szCs w:val="16"/>
-        </w:rPr>
-        <w:t xml:space="preserve">    --plugin AlphaMissense,file=${AM} \</w:t>
-      </w:r>
-    </w:p>
-    <w:p>
-      <w:pPr>
-        <w:shd w:fill="F2F2F2" w:color="auto" w:val="clear"/>
-        <w:spacing w:after="0" w:before="0"/>
-        <w:ind w:left="144" w:right="144"/>
-      </w:pPr>
-      <w:r>
-        <w:rPr>
-          <w:rFonts w:ascii="Consolas" w:cs="Consolas" w:eastAsia="Consolas" w:hAnsi="Consolas"/>
-          <w:sz w:val="16"/>
-          <w:szCs w:val="16"/>
-        </w:rPr>
-        <w:t xml:space="preserve">    --plugin SpliceAI,snv=${SAI_SNV},indel=${SAI_INDEL},cutoff=0.0 \</w:t>
-      </w:r>
-    </w:p>
-    <w:p>
-      <w:pPr>
-        <w:shd w:fill="F2F2F2" w:color="auto" w:val="clear"/>
-        <w:spacing w:after="0" w:before="0"/>
-        <w:ind w:left="144" w:right="144"/>
-      </w:pPr>
-      <w:r>
-        <w:rPr>
-          <w:rFonts w:ascii="Consolas" w:cs="Consolas" w:eastAsia="Consolas" w:hAnsi="Consolas"/>
-          <w:sz w:val="16"/>
-          <w:szCs w:val="16"/>
-        </w:rPr>
-        <w:t xml:space="preserve">    --plugin dbNSFP,${DBNSFP},BayesDel_noAF_score,PrimateAI_score,ESM1b_score,EVE_score,MetaRNN_score,phyloP100way_vertebrate,GERP++_RS \</w:t>
-      </w:r>
-    </w:p>
-    <w:p>
-      <w:pPr>
-        <w:shd w:fill="F2F2F2" w:color="auto" w:val="clear"/>
-        <w:spacing w:after="0" w:before="0"/>
-        <w:ind w:left="144" w:right="144"/>
-      </w:pPr>
-      <w:r>
-        <w:rPr>
-          <w:rFonts w:ascii="Consolas" w:cs="Consolas" w:eastAsia="Consolas" w:hAnsi="Consolas"/>
-          <w:sz w:val="16"/>
-          <w:szCs w:val="16"/>
-        </w:rPr>
-        <w:t xml:space="preserve">    --plugin UTRAnnotator,file=${UTR} --plugin NMD \</w:t>
-      </w:r>
-    </w:p>
-    <w:p>
-      <w:pPr>
-        <w:shd w:fill="F2F2F2" w:color="auto" w:val="clear"/>
-        <w:spacing w:after="0" w:before="0"/>
-        <w:ind w:left="144" w:right="144"/>
-      </w:pPr>
-      <w:r>
-        <w:rPr>
-          <w:rFonts w:ascii="Consolas" w:cs="Consolas" w:eastAsia="Consolas" w:hAnsi="Consolas"/>
-          <w:sz w:val="16"/>
-          <w:szCs w:val="16"/>
-        </w:rPr>
-        <w:t xml:space="preserve">    --custom file=${GNOMAD},short_name=gnomADv4,format=vcf,type=exact,coords=0,fields=AF_joint%AF_joint_grpmax%nhomalt_joint \</w:t>
-      </w:r>
-    </w:p>
-    <w:p>
-      <w:pPr>
-        <w:shd w:fill="F2F2F2" w:color="auto" w:val="clear"/>
-        <w:spacing w:after="0" w:before="0"/>
-        <w:ind w:left="144" w:right="144"/>
-      </w:pPr>
-      <w:r>
-        <w:rPr>
-          <w:rFonts w:ascii="Consolas" w:cs="Consolas" w:eastAsia="Consolas" w:hAnsi="Consolas"/>
-          <w:sz w:val="16"/>
-          <w:szCs w:val="16"/>
-        </w:rPr>
-        <w:t xml:space="preserve">    --custom file=${CLINVAR},short_name=ClinVar,format=vcf,type=exact,coords=0,fields=CLNSIG%CLNREVSTAT%CLNDN \</w:t>
-      </w:r>
-    </w:p>
-    <w:p>
-      <w:pPr>
-        <w:shd w:fill="F2F2F2" w:color="auto" w:val="clear"/>
-        <w:spacing w:after="140" w:before="0"/>
-        <w:ind w:left="144" w:right="144"/>
-      </w:pPr>
-      <w:r>
-        <w:rPr>
-          <w:rFonts w:ascii="Consolas" w:cs="Consolas" w:eastAsia="Consolas" w:hAnsi="Consolas"/>
-          <w:sz w:val="16"/>
-          <w:szCs w:val="16"/>
-        </w:rPr>
-        <w:t xml:space="preserve">    --custom file=${CCRE_BED},short_name=ENCODE_cCRE,format=bed,type=overlap</w:t>
-      </w:r>
-    </w:p>
-    <w:p>
-      <w:pPr>
-        <w:spacing w:after="120"/>
-      </w:pPr>
-      <w:r>
-        <w:rPr>
-          <w:rFonts w:ascii="Consolas" w:cs="Consolas" w:eastAsia="Consolas" w:hAnsi="Consolas"/>
-          <w:sz w:val="18"/>
-          <w:szCs w:val="18"/>
+          <w:rStyle w:val="InlineCode"/>
         </w:rPr>
         <w:t xml:space="preserve">trio-dnm annotate</w:t>
       </w:r>
@@ -12570,6 +12267,7 @@
     </w:p>
     <w:p>
       <w:pPr>
+        <w:pStyle w:val="Note"/>
         <w:pBdr>
           <w:left w:val="single" w:color="E0A030" w:sz="18" w:space="6"/>
         </w:pBdr>
@@ -12582,9 +12280,7 @@
       </w:r>
       <w:r>
         <w:rPr>
-          <w:rFonts w:ascii="Consolas" w:cs="Consolas" w:eastAsia="Consolas" w:hAnsi="Consolas"/>
-          <w:sz w:val="18"/>
-          <w:szCs w:val="18"/>
+          <w:rStyle w:val="InlineCode"/>
         </w:rPr>
         <w:t xml:space="preserve">conf/defaults.json</w:t>
       </w:r>
@@ -13143,6 +12839,7 @@
     </w:p>
     <w:p>
       <w:pPr>
+        <w:pStyle w:val="Note"/>
         <w:pBdr>
           <w:left w:val="single" w:color="E0A030" w:sz="18" w:space="6"/>
         </w:pBdr>
@@ -13536,9 +13233,7 @@
       </w:r>
       <w:r>
         <w:rPr>
-          <w:rFonts w:ascii="Consolas" w:cs="Consolas" w:eastAsia="Consolas" w:hAnsi="Consolas"/>
-          <w:sz w:val="18"/>
-          <w:szCs w:val="18"/>
+          <w:rStyle w:val="InlineCode"/>
         </w:rPr>
         <w:t xml:space="preserve">trio-dnm</w:t>
       </w:r>
@@ -13985,151 +13680,91 @@
     </w:p>
     <w:p>
       <w:pPr>
-        <w:shd w:fill="F2F2F2" w:color="auto" w:val="clear"/>
+        <w:pStyle w:val="CodeBlock"/>
         <w:spacing w:after="0" w:before="80"/>
-        <w:ind w:left="144" w:right="144"/>
-      </w:pPr>
-      <w:r>
-        <w:rPr>
-          <w:rFonts w:ascii="Consolas" w:cs="Consolas" w:eastAsia="Consolas" w:hAnsi="Consolas"/>
-          <w:sz w:val="16"/>
-          <w:szCs w:val="16"/>
-        </w:rPr>
+      </w:pPr>
+      <w:r>
         <w:t xml:space="preserve">gatk Mutect2 -R ${REF} -I tumor.bam -I normal.bam -normal ${NORMAL} \</w:t>
       </w:r>
     </w:p>
     <w:p>
       <w:pPr>
-        <w:shd w:fill="F2F2F2" w:color="auto" w:val="clear"/>
+        <w:pStyle w:val="CodeBlock"/>
         <w:spacing w:after="0" w:before="0"/>
-        <w:ind w:left="144" w:right="144"/>
-      </w:pPr>
-      <w:r>
-        <w:rPr>
-          <w:rFonts w:ascii="Consolas" w:cs="Consolas" w:eastAsia="Consolas" w:hAnsi="Consolas"/>
-          <w:sz w:val="16"/>
-          <w:szCs w:val="16"/>
-        </w:rPr>
+      </w:pPr>
+      <w:r>
         <w:t xml:space="preserve">    --germline-resource af-only-gnomad.hg38.vcf.gz --panel-of-normals pon.vcf.gz \</w:t>
       </w:r>
     </w:p>
     <w:p>
       <w:pPr>
-        <w:shd w:fill="F2F2F2" w:color="auto" w:val="clear"/>
+        <w:pStyle w:val="CodeBlock"/>
         <w:spacing w:after="0" w:before="0"/>
-        <w:ind w:left="144" w:right="144"/>
-      </w:pPr>
-      <w:r>
-        <w:rPr>
-          <w:rFonts w:ascii="Consolas" w:cs="Consolas" w:eastAsia="Consolas" w:hAnsi="Consolas"/>
-          <w:sz w:val="16"/>
-          <w:szCs w:val="16"/>
-        </w:rPr>
+      </w:pPr>
+      <w:r>
         <w:t xml:space="preserve">    --f1r2-tar-gz f1r2.tar.gz -O unfiltered.vcf.gz</w:t>
       </w:r>
     </w:p>
     <w:p>
       <w:pPr>
-        <w:shd w:fill="F2F2F2" w:color="auto" w:val="clear"/>
+        <w:pStyle w:val="CodeBlock"/>
         <w:spacing w:after="0" w:before="0"/>
-        <w:ind w:left="144" w:right="144"/>
-      </w:pPr>
-      <w:r>
-        <w:rPr>
-          <w:rFonts w:ascii="Consolas" w:cs="Consolas" w:eastAsia="Consolas" w:hAnsi="Consolas"/>
-          <w:sz w:val="16"/>
-          <w:szCs w:val="16"/>
-        </w:rPr>
+      </w:pPr>
+      <w:r>
         <w:t xml:space="preserve">gatk LearnReadOrientationModel -I f1r2.tar.gz -O rom.tar.gz</w:t>
       </w:r>
     </w:p>
     <w:p>
       <w:pPr>
-        <w:shd w:fill="F2F2F2" w:color="auto" w:val="clear"/>
+        <w:pStyle w:val="CodeBlock"/>
         <w:spacing w:after="0" w:before="0"/>
-        <w:ind w:left="144" w:right="144"/>
-      </w:pPr>
-      <w:r>
-        <w:rPr>
-          <w:rFonts w:ascii="Consolas" w:cs="Consolas" w:eastAsia="Consolas" w:hAnsi="Consolas"/>
-          <w:sz w:val="16"/>
-          <w:szCs w:val="16"/>
-        </w:rPr>
+      </w:pPr>
+      <w:r>
         <w:t xml:space="preserve">gatk GetPileupSummaries -I tumor.bam  -V common.vcf.gz -L common.vcf.gz -O t.table</w:t>
       </w:r>
     </w:p>
     <w:p>
       <w:pPr>
-        <w:shd w:fill="F2F2F2" w:color="auto" w:val="clear"/>
+        <w:pStyle w:val="CodeBlock"/>
         <w:spacing w:after="0" w:before="0"/>
-        <w:ind w:left="144" w:right="144"/>
-      </w:pPr>
-      <w:r>
-        <w:rPr>
-          <w:rFonts w:ascii="Consolas" w:cs="Consolas" w:eastAsia="Consolas" w:hAnsi="Consolas"/>
-          <w:sz w:val="16"/>
-          <w:szCs w:val="16"/>
-        </w:rPr>
+      </w:pPr>
+      <w:r>
         <w:t xml:space="preserve">gatk GetPileupSummaries -I normal.bam -V common.vcf.gz -L common.vcf.gz -O n.table</w:t>
       </w:r>
     </w:p>
     <w:p>
       <w:pPr>
-        <w:shd w:fill="F2F2F2" w:color="auto" w:val="clear"/>
+        <w:pStyle w:val="CodeBlock"/>
         <w:spacing w:after="0" w:before="0"/>
-        <w:ind w:left="144" w:right="144"/>
-      </w:pPr>
-      <w:r>
-        <w:rPr>
-          <w:rFonts w:ascii="Consolas" w:cs="Consolas" w:eastAsia="Consolas" w:hAnsi="Consolas"/>
-          <w:sz w:val="16"/>
-          <w:szCs w:val="16"/>
-        </w:rPr>
+      </w:pPr>
+      <w:r>
         <w:t xml:space="preserve">gatk CalculateContamination -I t.table -matched n.table -O contam.table --tumor-segmentation seg.table</w:t>
       </w:r>
     </w:p>
     <w:p>
       <w:pPr>
-        <w:shd w:fill="F2F2F2" w:color="auto" w:val="clear"/>
+        <w:pStyle w:val="CodeBlock"/>
         <w:spacing w:after="0" w:before="0"/>
-        <w:ind w:left="144" w:right="144"/>
-      </w:pPr>
-      <w:r>
-        <w:rPr>
-          <w:rFonts w:ascii="Consolas" w:cs="Consolas" w:eastAsia="Consolas" w:hAnsi="Consolas"/>
-          <w:sz w:val="16"/>
-          <w:szCs w:val="16"/>
-        </w:rPr>
+      </w:pPr>
+      <w:r>
         <w:t xml:space="preserve">gatk FilterMutectCalls -R ${REF} -V unfiltered.vcf.gz --contamination-table contam.table \</w:t>
       </w:r>
     </w:p>
     <w:p>
       <w:pPr>
-        <w:shd w:fill="F2F2F2" w:color="auto" w:val="clear"/>
+        <w:pStyle w:val="CodeBlock"/>
         <w:spacing w:after="0" w:before="0"/>
-        <w:ind w:left="144" w:right="144"/>
-      </w:pPr>
-      <w:r>
-        <w:rPr>
-          <w:rFonts w:ascii="Consolas" w:cs="Consolas" w:eastAsia="Consolas" w:hAnsi="Consolas"/>
-          <w:sz w:val="16"/>
-          <w:szCs w:val="16"/>
-        </w:rPr>
+      </w:pPr>
+      <w:r>
         <w:t xml:space="preserve">    --tumor-segmentation seg.table --ob-priors rom.tar.gz -O filtered.vcf.gz</w:t>
       </w:r>
     </w:p>
     <w:p>
       <w:pPr>
-        <w:shd w:fill="F2F2F2" w:color="auto" w:val="clear"/>
+        <w:pStyle w:val="CodeBlock"/>
         <w:spacing w:after="140" w:before="0"/>
-        <w:ind w:left="144" w:right="144"/>
-      </w:pPr>
-      <w:r>
-        <w:rPr>
-          <w:rFonts w:ascii="Consolas" w:cs="Consolas" w:eastAsia="Consolas" w:hAnsi="Consolas"/>
-          <w:sz w:val="16"/>
-          <w:szCs w:val="16"/>
-        </w:rPr>
+      </w:pPr>
+      <w:r>
         <w:t xml:space="preserve"># Strelka2 with Manta candidate indels; DeepSomatic (WGS/WES model) as the third caller</w:t>
       </w:r>
     </w:p>
@@ -14704,7 +14339,7 @@
             </w:r>
             <w:r>
               <w:rPr>
-                <w:rFonts w:ascii="Consolas" w:cs="Consolas" w:eastAsia="Consolas" w:hAnsi="Consolas"/>
+                <w:rStyle w:val="InlineCode"/>
                 <w:sz w:val="18"/>
                 <w:szCs w:val="18"/>
               </w:rPr>
@@ -14775,9 +14410,7 @@
       </w:r>
       <w:r>
         <w:rPr>
-          <w:rFonts w:ascii="Consolas" w:cs="Consolas" w:eastAsia="Consolas" w:hAnsi="Consolas"/>
-          <w:sz w:val="18"/>
-          <w:szCs w:val="18"/>
+          <w:rStyle w:val="InlineCode"/>
         </w:rPr>
         <w:t xml:space="preserve">call -m clonal</w:t>
       </w:r>
@@ -14929,9 +14562,7 @@
       </w:r>
       <w:r>
         <w:rPr>
-          <w:rFonts w:ascii="Consolas" w:cs="Consolas" w:eastAsia="Consolas" w:hAnsi="Consolas"/>
-          <w:sz w:val="18"/>
-          <w:szCs w:val="18"/>
+          <w:rStyle w:val="InlineCode"/>
         </w:rPr>
         <w:t xml:space="preserve">--mode tissue</w:t>
       </w:r>
@@ -14940,9 +14571,7 @@
       </w:r>
       <w:r>
         <w:rPr>
-          <w:rFonts w:ascii="Consolas" w:cs="Consolas" w:eastAsia="Consolas" w:hAnsi="Consolas"/>
-          <w:sz w:val="18"/>
-          <w:szCs w:val="18"/>
+          <w:rStyle w:val="InlineCode"/>
         </w:rPr>
         <w:t xml:space="preserve">SOMATIC_MOSAIC</w:t>
       </w:r>
@@ -14968,9 +14597,7 @@
       </w:r>
       <w:r>
         <w:rPr>
-          <w:rFonts w:ascii="Consolas" w:cs="Consolas" w:eastAsia="Consolas" w:hAnsi="Consolas"/>
-          <w:sz w:val="18"/>
-          <w:szCs w:val="18"/>
+          <w:rStyle w:val="InlineCode"/>
         </w:rPr>
         <w:t xml:space="preserve">trio-dnm ch-screen</w:t>
       </w:r>
@@ -15830,7 +15457,7 @@
           <w:p>
             <w:r>
               <w:rPr>
-                <w:rFonts w:ascii="Consolas" w:cs="Consolas" w:eastAsia="Consolas" w:hAnsi="Consolas"/>
+                <w:rStyle w:val="InlineCode"/>
                 <w:sz w:val="18"/>
                 <w:szCs w:val="18"/>
               </w:rPr>
@@ -15892,7 +15519,7 @@
           <w:p>
             <w:r>
               <w:rPr>
-                <w:rFonts w:ascii="Consolas" w:cs="Consolas" w:eastAsia="Consolas" w:hAnsi="Consolas"/>
+                <w:rStyle w:val="InlineCode"/>
                 <w:sz w:val="18"/>
                 <w:szCs w:val="18"/>
               </w:rPr>
@@ -15947,7 +15574,7 @@
           <w:p>
             <w:r>
               <w:rPr>
-                <w:rFonts w:ascii="Consolas" w:cs="Consolas" w:eastAsia="Consolas" w:hAnsi="Consolas"/>
+                <w:rStyle w:val="InlineCode"/>
                 <w:sz w:val="18"/>
                 <w:szCs w:val="18"/>
               </w:rPr>
@@ -16002,7 +15629,7 @@
           <w:p>
             <w:r>
               <w:rPr>
-                <w:rFonts w:ascii="Consolas" w:cs="Consolas" w:eastAsia="Consolas" w:hAnsi="Consolas"/>
+                <w:rStyle w:val="InlineCode"/>
                 <w:sz w:val="18"/>
                 <w:szCs w:val="18"/>
               </w:rPr>
@@ -16057,7 +15684,7 @@
           <w:p>
             <w:r>
               <w:rPr>
-                <w:rFonts w:ascii="Consolas" w:cs="Consolas" w:eastAsia="Consolas" w:hAnsi="Consolas"/>
+                <w:rStyle w:val="InlineCode"/>
                 <w:sz w:val="18"/>
                 <w:szCs w:val="18"/>
               </w:rPr>
@@ -16112,7 +15739,7 @@
           <w:p>
             <w:r>
               <w:rPr>
-                <w:rFonts w:ascii="Consolas" w:cs="Consolas" w:eastAsia="Consolas" w:hAnsi="Consolas"/>
+                <w:rStyle w:val="InlineCode"/>
                 <w:sz w:val="18"/>
                 <w:szCs w:val="18"/>
               </w:rPr>
@@ -16167,7 +15794,7 @@
           <w:p>
             <w:r>
               <w:rPr>
-                <w:rFonts w:ascii="Consolas" w:cs="Consolas" w:eastAsia="Consolas" w:hAnsi="Consolas"/>
+                <w:rStyle w:val="InlineCode"/>
                 <w:sz w:val="18"/>
                 <w:szCs w:val="18"/>
               </w:rPr>
@@ -16182,7 +15809,7 @@
             </w:r>
             <w:r>
               <w:rPr>
-                <w:rFonts w:ascii="Consolas" w:cs="Consolas" w:eastAsia="Consolas" w:hAnsi="Consolas"/>
+                <w:rStyle w:val="InlineCode"/>
                 <w:sz w:val="18"/>
                 <w:szCs w:val="18"/>
               </w:rPr>
@@ -16237,7 +15864,7 @@
           <w:p>
             <w:r>
               <w:rPr>
-                <w:rFonts w:ascii="Consolas" w:cs="Consolas" w:eastAsia="Consolas" w:hAnsi="Consolas"/>
+                <w:rStyle w:val="InlineCode"/>
                 <w:sz w:val="18"/>
                 <w:szCs w:val="18"/>
               </w:rPr>
@@ -16292,7 +15919,7 @@
           <w:p>
             <w:r>
               <w:rPr>
-                <w:rFonts w:ascii="Consolas" w:cs="Consolas" w:eastAsia="Consolas" w:hAnsi="Consolas"/>
+                <w:rStyle w:val="InlineCode"/>
                 <w:sz w:val="18"/>
                 <w:szCs w:val="18"/>
               </w:rPr>
@@ -16347,7 +15974,7 @@
           <w:p>
             <w:r>
               <w:rPr>
-                <w:rFonts w:ascii="Consolas" w:cs="Consolas" w:eastAsia="Consolas" w:hAnsi="Consolas"/>
+                <w:rStyle w:val="InlineCode"/>
                 <w:sz w:val="18"/>
                 <w:szCs w:val="18"/>
               </w:rPr>
@@ -16362,7 +15989,7 @@
             </w:r>
             <w:r>
               <w:rPr>
-                <w:rFonts w:ascii="Consolas" w:cs="Consolas" w:eastAsia="Consolas" w:hAnsi="Consolas"/>
+                <w:rStyle w:val="InlineCode"/>
                 <w:sz w:val="18"/>
                 <w:szCs w:val="18"/>
               </w:rPr>
@@ -16417,7 +16044,7 @@
           <w:p>
             <w:r>
               <w:rPr>
-                <w:rFonts w:ascii="Consolas" w:cs="Consolas" w:eastAsia="Consolas" w:hAnsi="Consolas"/>
+                <w:rStyle w:val="InlineCode"/>
                 <w:sz w:val="18"/>
                 <w:szCs w:val="18"/>
               </w:rPr>
@@ -17324,7 +16951,7 @@
             </w:r>
             <w:r>
               <w:rPr>
-                <w:rFonts w:ascii="Consolas" w:cs="Consolas" w:eastAsia="Consolas" w:hAnsi="Consolas"/>
+                <w:rStyle w:val="InlineCode"/>
                 <w:sz w:val="18"/>
                 <w:szCs w:val="18"/>
               </w:rPr>
@@ -17419,7 +17046,7 @@
             </w:r>
             <w:r>
               <w:rPr>
-                <w:rFonts w:ascii="Consolas" w:cs="Consolas" w:eastAsia="Consolas" w:hAnsi="Consolas"/>
+                <w:rStyle w:val="InlineCode"/>
                 <w:sz w:val="18"/>
                 <w:szCs w:val="18"/>
               </w:rPr>
@@ -17694,9 +17321,7 @@
       </w:r>
       <w:r>
         <w:rPr>
-          <w:rFonts w:ascii="Consolas" w:cs="Consolas" w:eastAsia="Consolas" w:hAnsi="Consolas"/>
-          <w:sz w:val="18"/>
-          <w:szCs w:val="18"/>
+          <w:rStyle w:val="InlineCode"/>
         </w:rPr>
         <w:t xml:space="preserve">trio_dnm_pipeline/</w:t>
       </w:r>
@@ -17705,9 +17330,7 @@
       </w:r>
       <w:r>
         <w:rPr>
-          <w:rFonts w:ascii="Consolas" w:cs="Consolas" w:eastAsia="Consolas" w:hAnsi="Consolas"/>
-          <w:sz w:val="18"/>
-          <w:szCs w:val="18"/>
+          <w:rStyle w:val="InlineCode"/>
         </w:rPr>
         <w:t xml:space="preserve">nextflow run main.nf -stub</w:t>
       </w:r>
@@ -17896,7 +17519,7 @@
           <w:p>
             <w:r>
               <w:rPr>
-                <w:rFonts w:ascii="Consolas" w:cs="Consolas" w:eastAsia="Consolas" w:hAnsi="Consolas"/>
+                <w:rStyle w:val="InlineCode"/>
                 <w:sz w:val="18"/>
                 <w:szCs w:val="18"/>
               </w:rPr>
@@ -18057,7 +17680,7 @@
           <w:p>
             <w:r>
               <w:rPr>
-                <w:rFonts w:ascii="Consolas" w:cs="Consolas" w:eastAsia="Consolas" w:hAnsi="Consolas"/>
+                <w:rStyle w:val="InlineCode"/>
                 <w:sz w:val="18"/>
                 <w:szCs w:val="18"/>
               </w:rPr>
@@ -18138,7 +17761,7 @@
           <w:p>
             <w:r>
               <w:rPr>
-                <w:rFonts w:ascii="Consolas" w:cs="Consolas" w:eastAsia="Consolas" w:hAnsi="Consolas"/>
+                <w:rStyle w:val="InlineCode"/>
                 <w:sz w:val="18"/>
                 <w:szCs w:val="18"/>
               </w:rPr>
@@ -18226,7 +17849,7 @@
           <w:p>
             <w:r>
               <w:rPr>
-                <w:rFonts w:ascii="Consolas" w:cs="Consolas" w:eastAsia="Consolas" w:hAnsi="Consolas"/>
+                <w:rStyle w:val="InlineCode"/>
                 <w:sz w:val="18"/>
                 <w:szCs w:val="18"/>
               </w:rPr>
@@ -18241,7 +17864,7 @@
             </w:r>
             <w:r>
               <w:rPr>
-                <w:rFonts w:ascii="Consolas" w:cs="Consolas" w:eastAsia="Consolas" w:hAnsi="Consolas"/>
+                <w:rStyle w:val="InlineCode"/>
                 <w:sz w:val="18"/>
                 <w:szCs w:val="18"/>
               </w:rPr>
@@ -18322,7 +17945,7 @@
           <w:p>
             <w:r>
               <w:rPr>
-                <w:rFonts w:ascii="Consolas" w:cs="Consolas" w:eastAsia="Consolas" w:hAnsi="Consolas"/>
+                <w:rStyle w:val="InlineCode"/>
                 <w:sz w:val="18"/>
                 <w:szCs w:val="18"/>
               </w:rPr>
@@ -18403,7 +18026,7 @@
           <w:p>
             <w:r>
               <w:rPr>
-                <w:rFonts w:ascii="Consolas" w:cs="Consolas" w:eastAsia="Consolas" w:hAnsi="Consolas"/>
+                <w:rStyle w:val="InlineCode"/>
                 <w:sz w:val="18"/>
                 <w:szCs w:val="18"/>
               </w:rPr>
@@ -18420,166 +18043,100 @@
     </w:p>
     <w:p>
       <w:pPr>
-        <w:shd w:fill="F2F2F2" w:color="auto" w:val="clear"/>
+        <w:pStyle w:val="CodeBlock"/>
         <w:spacing w:after="0" w:before="80"/>
-        <w:ind w:left="144" w:right="144"/>
-      </w:pPr>
-      <w:r>
-        <w:rPr>
-          <w:rFonts w:ascii="Consolas" w:cs="Consolas" w:eastAsia="Consolas" w:hAnsi="Consolas"/>
-          <w:sz w:val="16"/>
-          <w:szCs w:val="16"/>
-        </w:rPr>
+      </w:pPr>
+      <w:r>
         <w:t xml:space="preserve"># post-calling only</w:t>
       </w:r>
     </w:p>
     <w:p>
       <w:pPr>
-        <w:shd w:fill="F2F2F2" w:color="auto" w:val="clear"/>
+        <w:pStyle w:val="CodeBlock"/>
         <w:spacing w:after="0" w:before="0"/>
-        <w:ind w:left="144" w:right="144"/>
-      </w:pPr>
-      <w:r>
-        <w:rPr>
-          <w:rFonts w:ascii="Consolas" w:cs="Consolas" w:eastAsia="Consolas" w:hAnsi="Consolas"/>
-          <w:sz w:val="16"/>
-          <w:szCs w:val="16"/>
-        </w:rPr>
+      </w:pPr>
+      <w:r>
         <w:t xml:space="preserve">trio-dnm call     --vcf trio.norm.vcf.gz --ped trio.ped --fasta GRCh38.fa --exclude-bed masks.bed \</w:t>
       </w:r>
     </w:p>
     <w:p>
       <w:pPr>
-        <w:shd w:fill="F2F2F2" w:color="auto" w:val="clear"/>
+        <w:pStyle w:val="CodeBlock"/>
         <w:spacing w:after="0" w:before="0"/>
-        <w:ind w:left="144" w:right="144"/>
-      </w:pPr>
-      <w:r>
-        <w:rPr>
-          <w:rFonts w:ascii="Consolas" w:cs="Consolas" w:eastAsia="Consolas" w:hAnsi="Consolas"/>
-          <w:sz w:val="16"/>
-          <w:szCs w:val="16"/>
-        </w:rPr>
+      </w:pPr>
+      <w:r>
         <w:t xml:space="preserve">                  --caller deeptrio=dt.dnm.vcf.gz --caller triodenovo=tdn.vcf --out FAM001</w:t>
       </w:r>
     </w:p>
     <w:p>
       <w:pPr>
-        <w:shd w:fill="F2F2F2" w:color="auto" w:val="clear"/>
+        <w:pStyle w:val="CodeBlock"/>
         <w:spacing w:after="0" w:before="0"/>
-        <w:ind w:left="144" w:right="144"/>
-      </w:pPr>
-      <w:r>
-        <w:rPr>
-          <w:rFonts w:ascii="Consolas" w:cs="Consolas" w:eastAsia="Consolas" w:hAnsi="Consolas"/>
-          <w:sz w:val="16"/>
-          <w:szCs w:val="16"/>
-        </w:rPr>
+      </w:pPr>
+      <w:r>
         <w:t xml:space="preserve">trio-dnm annotate --vcf FAM001.vep.vcf --call-summary FAM001.call_summary.json --gene-table genes.tsv \</w:t>
       </w:r>
     </w:p>
     <w:p>
       <w:pPr>
-        <w:shd w:fill="F2F2F2" w:color="auto" w:val="clear"/>
+        <w:pStyle w:val="CodeBlock"/>
         <w:spacing w:after="0" w:before="0"/>
-        <w:ind w:left="144" w:right="144"/>
-      </w:pPr>
-      <w:r>
-        <w:rPr>
-          <w:rFonts w:ascii="Consolas" w:cs="Consolas" w:eastAsia="Consolas" w:hAnsi="Consolas"/>
-          <w:sz w:val="16"/>
-          <w:szCs w:val="16"/>
-        </w:rPr>
+      </w:pPr>
+      <w:r>
         <w:t xml:space="preserve">                  --fasta GRCh38.fa --signatures COSMIC_v3.4_SBS_GRCh38.txt \</w:t>
       </w:r>
     </w:p>
     <w:p>
       <w:pPr>
-        <w:shd w:fill="F2F2F2" w:color="auto" w:val="clear"/>
+        <w:pStyle w:val="CodeBlock"/>
         <w:spacing w:after="0" w:before="0"/>
-        <w:ind w:left="144" w:right="144"/>
-      </w:pPr>
-      <w:r>
-        <w:rPr>
-          <w:rFonts w:ascii="Consolas" w:cs="Consolas" w:eastAsia="Consolas" w:hAnsi="Consolas"/>
-          <w:sz w:val="16"/>
-          <w:szCs w:val="16"/>
-        </w:rPr>
+      </w:pPr>
+      <w:r>
         <w:t xml:space="preserve">                  --paternal-age 34 --maternal-age 31 --parent-of-origin FAM001.poo.bed --out FAM001</w:t>
       </w:r>
     </w:p>
     <w:p>
       <w:pPr>
-        <w:shd w:fill="F2F2F2" w:color="auto" w:val="clear"/>
+        <w:pStyle w:val="CodeBlock"/>
         <w:spacing w:after="0" w:before="0"/>
-        <w:ind w:left="144" w:right="144"/>
-      </w:pPr>
-      <w:r>
-        <w:rPr>
-          <w:rFonts w:ascii="Consolas" w:cs="Consolas" w:eastAsia="Consolas" w:hAnsi="Consolas"/>
-          <w:sz w:val="16"/>
-          <w:szCs w:val="16"/>
-        </w:rPr>
+      </w:pPr>
+      <w:r>
         <w:t xml:space="preserve">trio-dnm somatic  --vcf T.mutect2.vep.vcf --tumor T --normal P --trio-vcf trio.vcf.gz --father F --mother M \</w:t>
       </w:r>
     </w:p>
     <w:p>
       <w:pPr>
-        <w:shd w:fill="F2F2F2" w:color="auto" w:val="clear"/>
+        <w:pStyle w:val="CodeBlock"/>
         <w:spacing w:after="0" w:before="0"/>
-        <w:ind w:left="144" w:right="144"/>
-      </w:pPr>
-      <w:r>
-        <w:rPr>
-          <w:rFonts w:ascii="Consolas" w:cs="Consolas" w:eastAsia="Consolas" w:hAnsi="Consolas"/>
-          <w:sz w:val="16"/>
-          <w:szCs w:val="16"/>
-        </w:rPr>
+      </w:pPr>
+      <w:r>
         <w:t xml:space="preserve">                  --caller strelka2=snvs.vcf.gz,indels.vcf.gz --caller deepsomatic=ds.vcf.gz \</w:t>
       </w:r>
     </w:p>
     <w:p>
       <w:pPr>
-        <w:shd w:fill="F2F2F2" w:color="auto" w:val="clear"/>
+        <w:pStyle w:val="CodeBlock"/>
         <w:spacing w:after="0" w:before="0"/>
-        <w:ind w:left="144" w:right="144"/>
-      </w:pPr>
-      <w:r>
-        <w:rPr>
-          <w:rFonts w:ascii="Consolas" w:cs="Consolas" w:eastAsia="Consolas" w:hAnsi="Consolas"/>
-          <w:sz w:val="16"/>
-          <w:szCs w:val="16"/>
-        </w:rPr>
+      </w:pPr>
+      <w:r>
         <w:t xml:space="preserve">                  --segments T.segments.tsv --purity 0.6 --germline-annotated FAM001.annotated.tsv --out T</w:t>
       </w:r>
     </w:p>
     <w:p>
       <w:pPr>
-        <w:shd w:fill="F2F2F2" w:color="auto" w:val="clear"/>
+        <w:pStyle w:val="CodeBlock"/>
         <w:spacing w:after="0" w:before="0"/>
-        <w:ind w:left="144" w:right="144"/>
-      </w:pPr>
-      <w:r>
-        <w:rPr>
-          <w:rFonts w:ascii="Consolas" w:cs="Consolas" w:eastAsia="Consolas" w:hAnsi="Consolas"/>
-          <w:sz w:val="16"/>
-          <w:szCs w:val="16"/>
-        </w:rPr>
+      </w:pPr>
+      <w:r>
         <w:t xml:space="preserve"># full workflow</w:t>
       </w:r>
     </w:p>
     <w:p>
       <w:pPr>
-        <w:shd w:fill="F2F2F2" w:color="auto" w:val="clear"/>
+        <w:pStyle w:val="CodeBlock"/>
         <w:spacing w:after="140" w:before="0"/>
-        <w:ind w:left="144" w:right="144"/>
-      </w:pPr>
-      <w:r>
-        <w:rPr>
-          <w:rFonts w:ascii="Consolas" w:cs="Consolas" w:eastAsia="Consolas" w:hAnsi="Consolas"/>
-          <w:sz w:val="16"/>
-          <w:szCs w:val="16"/>
-        </w:rPr>
+      </w:pPr>
+      <w:r>
         <w:t xml:space="preserve">nextflow run main.nf -profile docker -params-file params.yaml</w:t>
       </w:r>
     </w:p>
@@ -19710,6 +19267,30 @@
       <w:szCs w:val="24"/>
     </w:rPr>
   </w:style>
+  <w:style w:type="paragraph" w:styleId="CodeBlock">
+    <w:name w:val="Code Block"/>
+    <w:basedOn w:val="Normal"/>
+    <w:qFormat/>
+    <w:pPr>
+      <w:keepLines/>
+      <w:shd w:fill="F2F2F2" w:color="auto" w:val="clear"/>
+      <w:ind w:left="144" w:right="144"/>
+    </w:pPr>
+    <w:rPr>
+      <w:rFonts w:ascii="Consolas" w:cs="Consolas" w:eastAsia="Consolas" w:hAnsi="Consolas"/>
+      <w:sz w:val="16"/>
+      <w:szCs w:val="16"/>
+    </w:rPr>
+  </w:style>
+  <w:style w:type="paragraph" w:styleId="Note">
+    <w:name w:val="Note"/>
+    <w:basedOn w:val="Normal"/>
+    <w:qFormat/>
+    <w:rPr>
+      <w:sz w:val="20"/>
+      <w:szCs w:val="20"/>
+    </w:rPr>
+  </w:style>
   <w:style w:type="paragraph" w:styleId="Heading3">
     <w:name w:val="Heading 3"/>
     <w:basedOn w:val="Normal"/>
@@ -19728,5 +19309,17 @@
       <w:szCs w:val="21"/>
     </w:rPr>
   </w:style>
+  <w:style w:type="character" w:styleId="InlineCode">
+    <w:name w:val="Inline Code"/>
+    <w:basedOn w:val="DefaultParagraphFont"/>
+    <w:uiPriority w:val="99"/>
+    <w:unhideWhenUsed/>
+    <w:rPr>
+      <w:rFonts w:ascii="Consolas" w:cs="Consolas" w:eastAsia="Consolas" w:hAnsi="Consolas"/>
+      <w:color w:val="1F4E79"/>
+      <w:sz w:val="18"/>
+      <w:szCs w:val="18"/>
+    </w:rPr>
+  </w:style>
 </w:styles>
 </file>
</xml_diff>

<commit_message>
Fix issues from final verification pass
- --extra-vcf records are deduplicated per trio, so a joint cohort VCF no longer
  hides one trio's second-engine-only call
- hemizygous het-like VAF (0.40-0.70) stays germline, flagged HEMIZYGOUS_HET_LIKE
- 'nan' copy-number values are treated as missing (no crash in multiplicity)
- annotate resolves the signature matrix before writing any output
- missing input files give a one-line error (exit 2) instead of a traceback
- report surfaces the Mendelian-error warning even below the gate's site minimum
- somalier extract gets only the sites VCF, not its staged index
- README/protocol describe the actual container/resource staging model, the
  FASTQ stub run, the candidate-site recipe for strand pileups, the Mendelian
  gate site minimum and hemizygous routing; somatic.py stage number

Co-Authored-By: Claude Opus 5.5 <noreply@anthropic.com>
Claude-Session: https://claude.ai/code/session_01VEVoh7uYcmCbtW2HcZednP
</commit_message>
<xml_diff>
--- a/trio_dnm_pipeline/docs/Trio_DNM_Pipeline_Protocol_v2.0.docx
+++ b/trio_dnm_pipeline/docs/Trio_DNM_Pipeline_Protocol_v2.0.docx
@@ -4852,16 +4852,43 @@
         <w:t xml:space="preserve">trio-dnm</w:t>
       </w:r>
       <w:r>
-        <w:t xml:space="preserve"> tasks run in a plain Python image with the project directory and </w:t>
+        <w:t xml:space="preserve"> tasks stage the </w:t>
       </w:r>
       <w:r>
         <w:rPr>
           <w:rStyle w:val="InlineCode"/>
         </w:rPr>
-        <w:t xml:space="preserve">params.resource_dir</w:t>
-      </w:r>
-      <w:r>
-        <w:t xml:space="preserve"> mounted read-only, or in a trio-dnm image built from the provided Dockerfile (see </w:t>
+        <w:t xml:space="preserve">trio_dnm</w:t>
+      </w:r>
+      <w:r>
+        <w:t xml:space="preserve"> package into each task directory and put it on </w:t>
+      </w:r>
+      <w:r>
+        <w:rPr>
+          <w:rStyle w:val="InlineCode"/>
+        </w:rPr>
+        <w:t xml:space="preserve">PYTHONPATH</w:t>
+      </w:r>
+      <w:r>
+        <w:t xml:space="preserve">, so they run in any Python ≥ 3.10 image (default </w:t>
+      </w:r>
+      <w:r>
+        <w:rPr>
+          <w:rStyle w:val="InlineCode"/>
+        </w:rPr>
+        <w:t xml:space="preserve">python:3.11</w:t>
+      </w:r>
+      <w:r>
+        <w:t xml:space="preserve">) or in the image built from the provided Dockerfile. Every resource file (with any index next to it) is staged into the tasks as a Nextflow </w:t>
+      </w:r>
+      <w:r>
+        <w:rPr>
+          <w:rStyle w:val="InlineCode"/>
+        </w:rPr>
+        <w:t xml:space="preserve">path</w:t>
+      </w:r>
+      <w:r>
+        <w:t xml:space="preserve"> input, so it is visible inside Docker/Singularity containers without bind mounts (see the header of </w:t>
       </w:r>
       <w:r>
         <w:rPr>
@@ -6181,7 +6208,16 @@
         <w:t xml:space="preserve">trio-dnm call</w:t>
       </w:r>
       <w:r>
-        <w:t xml:space="preserve">: typically 0.5–2 %; &gt; 5 % indicates a swap or contamination and halts </w:t>
+        <w:t xml:space="preserve">: typically 0.5–2 %; &gt; 5 % indicates a swap or contamination. Over ≥ 1000 informative sites (</w:t>
+      </w:r>
+      <w:r>
+        <w:rPr>
+          <w:rStyle w:val="InlineCode"/>
+        </w:rPr>
+        <w:t xml:space="preserve">qc.mie_min_sites</w:t>
+      </w:r>
+      <w:r>
+        <w:t xml:space="preserve">) this halts </w:t>
       </w:r>
       <w:r>
         <w:rPr>
@@ -6190,7 +6226,7 @@
         <w:t xml:space="preserve">call</w:t>
       </w:r>
       <w:r>
-        <w:t xml:space="preserve"> (§3.3).</w:t>
+        <w:t xml:space="preserve"> (§3.3); below that (small panels) the gate is not applied, but the rate and a warning are still reported in the call summary and HTML report.</w:t>
       </w:r>
     </w:p>
     <w:p>
@@ -9723,7 +9759,16 @@
         <w:t xml:space="preserve">POSSIBLE_MOSAIC_NEEDS_DEPTH</w:t>
       </w:r>
       <w:r>
-        <w:t xml:space="preserve"> for review. Candidates with significant low-level parental ALT reads, including parents genotyped 0/1 whose VAF is significantly sub-heterozygous, are routed to the parental-mosaic track (§9.4).</w:t>
+        <w:t xml:space="preserve"> for review. Hemizygous regions (male chrX/chrY non-PAR) use the same VAF &lt; 0.40 limit with the binomial test against the hemizygous expectation; a heterozygous-looking VAF (0.40–0.70) there suggests sex-chromosome aneuploidy or a paralog artefact, so the candidate stays germline, fails the hemizygous VAF rule and is flagged </w:t>
+      </w:r>
+      <w:r>
+        <w:rPr>
+          <w:rStyle w:val="InlineCode"/>
+        </w:rPr>
+        <w:t xml:space="preserve">HEMIZYGOUS_HET_LIKE</w:t>
+      </w:r>
+      <w:r>
+        <w:t xml:space="preserve">. Candidates with significant low-level parental ALT reads, including parents genotyped 0/1 whose VAF is significantly sub-heterozygous, are routed to the parental-mosaic track (§9.4).</w:t>
       </w:r>
     </w:p>
     <w:p>
@@ -19224,7 +19269,7 @@
         <w:t xml:space="preserve">trio_dnm_pipeline/</w:t>
       </w:r>
       <w:r>
-        <w:t xml:space="preserve"> implements this protocol. The Python engine is dependency-free and covered by an automated test suite on a synthetic trio (true DNM, parental leakage, parental mosaic, proband mosaic, common variant, masked region, homopolymer, low MQ, inherited, male chrX hemizygous DNM), annotation/ACMG scenarios, somatic, CH, QC-gate and parser tests. The Nextflow workflow has stub blocks for a dry run on bundled placeholder inputs (</w:t>
+        <w:t xml:space="preserve"> implements this protocol. The Python engine is dependency-free and covered by an automated test suite on a synthetic trio (true DNM, parental leakage, parental mosaic, proband mosaic, common variant, masked region, homopolymer, low MQ, inherited, male chrX hemizygous DNM), annotation/ACMG scenarios, somatic, CH, QC-gate and parser tests. Every Nextflow process has a stub block; stub dry runs on bundled placeholder inputs (</w:t>
       </w:r>
       <w:r>
         <w:rPr>
@@ -19233,7 +19278,16 @@
         <w:t xml:space="preserve">nextflow run main.nf -stub -profile test_stub</w:t>
       </w:r>
       <w:r>
-        <w:t xml:space="preserve">). It has not yet been executed end-to-end and must be validated on GIAB trio HG002/HG003/HG004 before production use. </w:t>
+        <w:t xml:space="preserve">, and with </w:t>
+      </w:r>
+      <w:r>
+        <w:rPr>
+          <w:rStyle w:val="InlineCode"/>
+        </w:rPr>
+        <w:t xml:space="preserve">-params-file tests/nextflow/params_fastq.yaml</w:t>
+      </w:r>
+      <w:r>
+        <w:t xml:space="preserve"> for FASTQ input) complete without failures on Nextflow 24.10.4. The workflow has not yet been executed with the real tools and must be validated on GIAB trio HG002/HG003/HG004 before production use. </w:t>
       </w:r>
       <w:r>
         <w:rPr>
@@ -19242,16 +19296,43 @@
         <w:t xml:space="preserve">trio-dnm</w:t>
       </w:r>
       <w:r>
-        <w:t xml:space="preserve"> tasks run with the project directory and </w:t>
+        <w:t xml:space="preserve"> tasks stage the </w:t>
       </w:r>
       <w:r>
         <w:rPr>
           <w:rStyle w:val="InlineCode"/>
         </w:rPr>
-        <w:t xml:space="preserve">params.resource_dir</w:t>
-      </w:r>
-      <w:r>
-        <w:t xml:space="preserve"> mounted read-only into the container, or in a trio-dnm image built from the provided Dockerfile (see </w:t>
+        <w:t xml:space="preserve">trio_dnm</w:t>
+      </w:r>
+      <w:r>
+        <w:t xml:space="preserve"> package into each task directory and put it on </w:t>
+      </w:r>
+      <w:r>
+        <w:rPr>
+          <w:rStyle w:val="InlineCode"/>
+        </w:rPr>
+        <w:t xml:space="preserve">PYTHONPATH</w:t>
+      </w:r>
+      <w:r>
+        <w:t xml:space="preserve">, so they run in any Python ≥ 3.10 image (default </w:t>
+      </w:r>
+      <w:r>
+        <w:rPr>
+          <w:rStyle w:val="InlineCode"/>
+        </w:rPr>
+        <w:t xml:space="preserve">python:3.11</w:t>
+      </w:r>
+      <w:r>
+        <w:t xml:space="preserve">) or in the image built from the provided Dockerfile. Every resource file (with any index next to it) is staged into the tasks as a Nextflow </w:t>
+      </w:r>
+      <w:r>
+        <w:rPr>
+          <w:rStyle w:val="InlineCode"/>
+        </w:rPr>
+        <w:t xml:space="preserve">path</w:t>
+      </w:r>
+      <w:r>
+        <w:t xml:space="preserve"> input, so it is visible inside Docker/Singularity containers without bind mounts (see the header of </w:t>
       </w:r>
       <w:r>
         <w:rPr>

</xml_diff>